<commit_message>
External validation, cost benchmark, review rounds 1-10 and revisions, journal fit audit
Co-Authored-By: Claude Opus 5.5 <noreply@anthropic.com>
Claude-Session: https://claude.ai/code/session_011swGQJjskr3eenk5bukhrn
</commit_message>
<xml_diff>
--- a/manuscript/Final_Manuscript.docx
+++ b/manuscript/Final_Manuscript.docx
@@ -301,7 +301,7 @@
         <w:t xml:space="preserve"> </w:t>
       </w:r>
       <w:r>
-        <w:t xml:space="preserve">from duplicate-group sizes, and we prove that a novelty-Mondrian conformal predictor is valid for any mix of seen and new records. Across 103 OpenML-CC18 and OpenML-CTR23 datasets, five learners and four scores, the predicted exposure matched the observed exposure (mean absolute error 0.0012). The pre-registered hypothesis that the typical duplicated dataset under-covers new records was not supported (median gaps −0.8 to +2.6 percentage points). Shortfalls were concentrated where exposure was high and seen records were over-covered, reaching −16.9 points, and controlled duplicate injection reproduced the predicted dose–response. Novelty-Mondrian calibration restored nominal coverage on new records at a median set-size cost of at most 4.4%.</w:t>
+        <w:t xml:space="preserve">from duplicate-group sizes, and we prove that a novelty-Mondrian conformal predictor is valid for any mix of seen and new records. Across 103 OpenML-CC18 and OpenML-CTR23 datasets, five learners and four scores, the predicted exposure matched the observed exposure (mean absolute error 0.0012). The pre-specified primary hypothesis that the typical duplicated dataset under-covers new records was not supported: median gaps were −0.8 to +0.5 percentage points, excluding a tie-inflated k-NN variant. Shortfalls were concentrated where exposure was high and seen records were over-covered, reaching −16.9 points, and they were reproduced in external defect-prediction and intrusion-detection data and, as a dose–response, by controlled duplicate injection. Novelty-Mondrian calibration restored nominal coverage on new records at a median set-size cost of at most 4.4%.</w:t>
       </w:r>
     </w:p>
     <w:p>
@@ -393,7 +393,7 @@
         <w:pStyle w:val="BodyText"/>
       </w:pPr>
       <w:r>
-        <w:t xml:space="preserve">Rows are not always distinct records. Tabular benchmarks contain repeated feature vectors, because the same event was logged twice, because the same entity was measured repeatedly, or because a coarse discrete feature space makes identical profiles recur. Recent audits found duplicated rows in about half of the datasets in widely used tabular benchmark collections (Li 2026), and duplication is a documented quality problem of well-known datasets such as the NASA software-defect data (Gray et al. 2011; Shepperd et al. 2013). Under a random row split, some test rows then have exact copies in the training set. Duplicate leakage of this kind inflates accuracy and can change model rankings (Li 2026; Roth 2026), but its effect on</w:t>
+        <w:t xml:space="preserve">Rows are not always distinct records. Tabular benchmarks contain repeated feature vectors, because the same event was logged twice, because the same entity was measured repeatedly, or because a coarse discrete feature space makes identical profiles recur. A recent audit (Li 2026, a preprint) found duplicated rows in about half of the datasets in widely used tabular benchmark collections, which our own audit confirms (53 of 103 datasets), and duplication is a documented quality problem of well-known datasets such as the NASA software-defect data (Gray et al. 2011; Shepperd et al. 2013). Under a random row split, some test rows then have exact copies in the training set. Duplicate leakage of this kind inflates accuracy and can change model rankings (Li 2026; Roth 2026; both preprints), but its effect on</w:t>
       </w:r>
       <w:r>
         <w:t xml:space="preserve"> </w:t>
@@ -665,7 +665,7 @@
         <w:t xml:space="preserve"> </w:t>
       </w:r>
       <w:r>
-        <w:t xml:space="preserve">Calibrating seen and novel records separately (novelty-Mondrian CP) is exactly valid for both groups, and therefore for any deployment mix of seen and new records (Proposition 3 and Corollary 1).</w:t>
+        <w:t xml:space="preserve">Calibrating seen and novel records separately is exactly valid for both groups, and therefore for any deployment mix of seen and new records (Proposition 3 and Corollary 1). The method is standard Mondrian CP (Vovk et al. 2022); what is new is the taxonomy, which is defined by membership of the training set, and the argument that this data-dependent taxonomy is admissible.</w:t>
       </w:r>
     </w:p>
     <w:p>
@@ -681,13 +681,13 @@
           <w:bCs/>
           <w:b/>
         </w:rPr>
-        <w:t xml:space="preserve">A pre-registered large-scale evaluation</w:t>
-      </w:r>
-      <w:r>
-        <w:t xml:space="preserve"> </w:t>
-      </w:r>
-      <w:r>
-        <w:t xml:space="preserve">on 103 datasets of the OpenML-CC18 and OpenML-CTR23 suites, with five learners, four nonconformity scores, three miscoverage levels, a group-aware split, controlled duplicate-injection and model-capacity experiments, and an analysis of probability calibration.</w:t>
+        <w:t xml:space="preserve">A large-scale evaluation following a pre-specified protocol</w:t>
+      </w:r>
+      <w:r>
+        <w:t xml:space="preserve"> </w:t>
+      </w:r>
+      <w:r>
+        <w:t xml:space="preserve">(committed to version control before the full runs, not lodged in an external registry) on 103 datasets of the OpenML-CC18 and OpenML-CTR23 suites, with five learners, four nonconformity scores, three miscoverage levels, a group-aware split, controlled duplicate-injection and model-capacity experiments, an analysis of probability calibration, and an external validation on defect-prediction and intrusion-detection data with documented duplication.</w:t>
       </w:r>
     </w:p>
     <w:p>
@@ -695,7 +695,7 @@
         <w:pStyle w:val="FirstParagraph"/>
       </w:pPr>
       <w:r>
-        <w:t xml:space="preserve">The evidence supports a more nuanced conclusion than the pre-registered primary hypothesis. For the</w:t>
+        <w:t xml:space="preserve">The evidence supports a more nuanced conclusion than the pre-specified primary hypothesis. For the</w:t>
       </w:r>
       <w:r>
         <w:t xml:space="preserve"> </w:t>
@@ -711,7 +711,7 @@
         <w:t xml:space="preserve"> </w:t>
       </w:r>
       <w:r>
-        <w:t xml:space="preserve">duplicated benchmark dataset, coverage on novel records is within about 1 percentage point of nominal, and the primary test was not significant. The shortfall is concentrated in datasets with high exposure whose seen records are over-covered. There it reaches −16.9 points, exactly as the theory predicts, while datasets with equally high exposure but conflicting duplicate labels are unaffected. Because both quantities can be audited cheaply, at-risk datasets can be identified in advance, and novelty-Mondrian calibration removes the problem at a small cost in set size. The pipeline, raw results and analysis code are released.</w:t>
+        <w:t xml:space="preserve">duplicated benchmark dataset, coverage on novel records is within about 1 percentage point of nominal, and the primary test was not significant. The shortfall is concentrated in datasets with high exposure whose seen records are over-covered. There it reaches −16.9 points in the benchmark suites and −27.5 points in the external data, as the theory predicts. By contrast, a dataset with equally high exposure but conflicting duplicate labels (cps88wages) was unaffected. Because both quantities can be audited cheaply, at-risk datasets can be identified in advance, and novelty-Mondrian calibration removes the problem at a small cost in set size. The pipeline, raw results and analysis code are released.</w:t>
       </w:r>
     </w:p>
     <w:bookmarkEnd w:id="20"/>
@@ -769,7 +769,7 @@
         <w:t xml:space="preserve">marginal</w:t>
       </w:r>
       <w:r>
-        <w:t xml:space="preserve">: it averages over the joint distribution of covariates and labels. Exact coverage conditional on an arbitrary covariate value cannot be achieved without further assumptions (Vovk 2012; Foygel Barber et al. 2021). Coverage conditional on membership of finitely many pre-specified categories can be achieved, by Mondrian (category-conditional) CP (Vovk et al. 2022) or, more generally, by calibration over a function class (Gibbs et al. 2025). Group-conditional calibration has been used to equalize coverage across protected groups (Romano et al. 2020b), classes (Löfström et al. 2015; Ding et al. 2023) and difficulty strata (Papadopoulos et al. 2011; Boström and Johansson 2020); localized CP reweights calibration scores around a test point (Guan 2023). Robustness of CP to departures from exchangeability is analysed by Tibshirani et al. (2019) and Barber et al. (2023). For data with a known grouping, e.g. repeated measurements of subjects, Dunn et al. (2023) construct prediction sets for new groups. None of these works considers the grouping that arises</w:t>
+        <w:t xml:space="preserve">: it averages over the joint distribution of covariates and labels. Exact coverage conditional on an arbitrary covariate value cannot be achieved without further assumptions (Vovk 2012; Foygel Barber et al. 2021). Coverage conditional on membership of finitely many pre-specified categories can be achieved, by Mondrian (category-conditional) CP (Vovk et al. 2022) or, more generally, by calibration over a function class (Gibbs et al. 2025) or multivalid calibration over overlapping groups (Bastani et al. 2022). For disjoint groups, conditional calibration reduces to Mondrian calibration. Group-conditional calibration has been used to equalize coverage across protected groups (Romano et al. 2020b), classes (Löfström et al. 2015; Ding et al. 2023) and difficulty strata (Papadopoulos et al. 2011; Boström and Johansson 2020); localized CP reweights calibration scores around a test point (Guan 2023). Robustness of CP to departures from exchangeability is analysed by Tibshirani et al. (2019) and Barber et al. (2023). For data with a known grouping, e.g. repeated measurements of subjects, Dunn et al. (2023) construct prediction sets for new groups. None of these works considers the grouping that arises</w:t>
       </w:r>
       <w:r>
         <w:t xml:space="preserve"> </w:t>
@@ -5112,22 +5112,7 @@
         <w:pStyle w:val="FirstParagraph"/>
       </w:pPr>
       <w:r>
-        <w:t xml:space="preserve">The protocol below was written and committed to version control before any full-scale run (Sect.</w:t>
-      </w:r>
-      <w:r>
-        <w:t xml:space="preserve"> </w:t>
-      </w:r>
-      <w:r>
-        <w:t xml:space="preserve">“</w:t>
-      </w:r>
-      <w:r>
-        <w:t xml:space="preserve">Data and code availability</w:t>
-      </w:r>
-      <w:r>
-        <w:t xml:space="preserve">”</w:t>
-      </w:r>
-      <w:r>
-        <w:t xml:space="preserve">). Deviations are listed in Online Resource 1.</w:t>
+        <w:t xml:space="preserve">The protocol below was written and committed to version control before any full-scale run (it was not lodged in an external registry). Deviations and post-hoc analyses are listed in Online Resource 1 (Table S2).</w:t>
       </w:r>
     </w:p>
     <w:bookmarkStart w:id="29" w:name="data"/>
@@ -5607,7 +5592,7 @@
         </m:r>
       </m:oMath>
       <w:r>
-        <w:t xml:space="preserve">. Differences between learners were assessed with Friedman tests (Friedman 1937) and Holm-corrected pairwise Wilcoxon tests.</w:t>
+        <w:t xml:space="preserve">. Differences between learners were assessed with Friedman tests (Friedman 1937) and Holm-corrected pairwise Wilcoxon tests. Spearman correlations for H1a are reported per family without multiplicity correction.</w:t>
       </w:r>
     </w:p>
     <w:bookmarkEnd w:id="31"/>
@@ -6062,9 +6047,27 @@
         <w:t xml:space="preserve">Novel test rows were binned by quintiles of their distance to the nearest training row, in the standardized feature space. The bin edges came from leave-one-out nearest-neighbour distances within the training set, so the taxonomy depends on training data only. We report split-CP coverage per bin and a six-bin Mondrian variant (Boström and Johansson 2020). This analysis was not part of the confirmatory hypotheses.</w:t>
       </w:r>
     </w:p>
+    <w:p>
+      <w:pPr>
+        <w:pStyle w:val="BodyText"/>
+      </w:pPr>
+      <w:r>
+        <w:rPr>
+          <w:bCs/>
+          <w:b/>
+        </w:rPr>
+        <w:t xml:space="preserve">Computational cost.</w:t>
+      </w:r>
+      <w:r>
+        <w:t xml:space="preserve"> </w:t>
+      </w:r>
+      <w:r>
+        <w:t xml:space="preserve">On the five largest datasets of each suite (30,000 rows), we timed the record hashing, the audit, the seen/novel taxonomy and the threshold computation of split CP and novelty-Mondrian CP (median of 5 repetitions on one CPU core).</w:t>
+      </w:r>
+    </w:p>
     <w:bookmarkEnd w:id="32"/>
     <w:bookmarkEnd w:id="33"/>
-    <w:bookmarkStart w:id="62" w:name="results"/>
+    <w:bookmarkStart w:id="63" w:name="results"/>
     <w:p>
       <w:pPr>
         <w:pStyle w:val="Heading1"/>
@@ -6140,9 +6143,733 @@
         </m:r>
       </m:oMath>
       <w:r>
-        <w:t xml:space="preserve">) contains 24 classification and 12 regression datasets, with median predicted exposure 0.104 (maximum 0.853). In 18 of them, at least 10% of test rows are expected to have an exact training copy, and in 9 at least 30%. The CLEAN null-control set contains 32 classification and 18 regression datasets, and 17 datasets have negligible exposure. The audit statistics for every dataset are listed in Online Resource 1.</w:t>
-      </w:r>
-    </w:p>
+        <w:t xml:space="preserve">) contains 24 classification and 12 regression datasets, with median predicted exposure 0.104 (maximum 0.853). In 18 of them, at least 10% of test rows are expected to have an exact training copy, and in 9 at least 30%. The CLEAN null-control set contains 32 classification and 18 regression datasets, and 17 datasets have negligible exposure. Table 1 summarizes the audit; the statistics for every dataset are listed in Online Resource 1 (Table S1).</w:t>
+      </w:r>
+    </w:p>
+    <w:p>
+      <w:pPr>
+        <w:pStyle w:val="BodyText"/>
+      </w:pPr>
+      <w:r>
+        <w:rPr>
+          <w:bCs/>
+          <w:b/>
+        </w:rPr>
+        <w:t xml:space="preserve">Table 1</w:t>
+      </w:r>
+      <w:r>
+        <w:t xml:space="preserve"> </w:t>
+      </w:r>
+      <w:r>
+        <w:t xml:space="preserve">Label-free duplicate audit by task and analysis set (medians over datasets). DUP: predicted exposure</w:t>
+      </w:r>
+      <w:r>
+        <w:t xml:space="preserve"> </w:t>
+      </w:r>
+      <m:oMath>
+        <m:acc>
+          <m:accPr>
+            <m:chr m:val="‾"/>
+          </m:accPr>
+          <m:e>
+            <m:r>
+              <m:t>π</m:t>
+            </m:r>
+          </m:e>
+        </m:acc>
+        <m:r>
+          <m:rPr>
+            <m:sty m:val="p"/>
+          </m:rPr>
+          <m:t>≥</m:t>
+        </m:r>
+        <m:r>
+          <m:t>0.01</m:t>
+        </m:r>
+      </m:oMath>
+      <w:r>
+        <w:t xml:space="preserve">; LOW:</w:t>
+      </w:r>
+      <w:r>
+        <w:t xml:space="preserve"> </w:t>
+      </w:r>
+      <m:oMath>
+        <m:r>
+          <m:t>0</m:t>
+        </m:r>
+        <m:r>
+          <m:rPr>
+            <m:sty m:val="p"/>
+          </m:rPr>
+          <m:t>&lt;</m:t>
+        </m:r>
+        <m:acc>
+          <m:accPr>
+            <m:chr m:val="‾"/>
+          </m:accPr>
+          <m:e>
+            <m:r>
+              <m:t>π</m:t>
+            </m:r>
+          </m:e>
+        </m:acc>
+        <m:r>
+          <m:rPr>
+            <m:sty m:val="p"/>
+          </m:rPr>
+          <m:t>&lt;</m:t>
+        </m:r>
+        <m:r>
+          <m:t>0.01</m:t>
+        </m:r>
+      </m:oMath>
+      <w:r>
+        <w:t xml:space="preserve">; CLEAN: no duplicated rows</w:t>
+      </w:r>
+    </w:p>
+    <w:tbl>
+      <w:tblPr>
+        <w:tblStyle w:val="Table"/>
+        <w:tblW w:type="pct" w:w="5000"/>
+        <w:tblLook w:firstRow="1" w:lastRow="0" w:firstColumn="0" w:lastColumn="0" w:noHBand="0" w:noVBand="0" w:val="0020"/>
+        <w:jc w:val="start"/>
+      </w:tblPr>
+      <w:tblGrid>
+        <w:gridCol w:w="1131"/>
+        <w:gridCol w:w="1131"/>
+        <w:gridCol w:w="1131"/>
+        <w:gridCol w:w="1131"/>
+        <w:gridCol w:w="1131"/>
+        <w:gridCol w:w="1131"/>
+        <w:gridCol w:w="1131"/>
+      </w:tblGrid>
+      <w:tr>
+        <w:trPr>
+          <w:tblHeader w:val="true"/>
+        </w:trPr>
+        <w:tc>
+          <w:tcPr/>
+          <w:p>
+            <w:pPr>
+              <w:pStyle w:val="Compact"/>
+              <w:jc w:val="left"/>
+            </w:pPr>
+            <w:r>
+              <w:t xml:space="preserve">Task</w:t>
+            </w:r>
+          </w:p>
+        </w:tc>
+        <w:tc>
+          <w:tcPr/>
+          <w:p>
+            <w:pPr>
+              <w:pStyle w:val="Compact"/>
+              <w:jc w:val="left"/>
+            </w:pPr>
+            <w:r>
+              <w:t xml:space="preserve">Set</w:t>
+            </w:r>
+          </w:p>
+        </w:tc>
+        <w:tc>
+          <w:tcPr/>
+          <w:p>
+            <w:pPr>
+              <w:pStyle w:val="Compact"/>
+              <w:jc w:val="left"/>
+            </w:pPr>
+            <w:r>
+              <w:t xml:space="preserve">Datasets</w:t>
+            </w:r>
+          </w:p>
+        </w:tc>
+        <w:tc>
+          <w:tcPr/>
+          <w:p>
+            <w:pPr>
+              <w:pStyle w:val="Compact"/>
+              <w:jc w:val="left"/>
+            </w:pPr>
+            <w:r>
+              <w:t xml:space="preserve">Rows</w:t>
+            </w:r>
+          </w:p>
+        </w:tc>
+        <w:tc>
+          <w:tcPr/>
+          <w:p>
+            <w:pPr>
+              <w:pStyle w:val="Compact"/>
+              <w:jc w:val="left"/>
+            </w:pPr>
+            <w:r>
+              <w:t xml:space="preserve">Rows in duplicate groups</w:t>
+            </w:r>
+          </w:p>
+        </w:tc>
+        <w:tc>
+          <w:tcPr/>
+          <w:p>
+            <w:pPr>
+              <w:pStyle w:val="Compact"/>
+              <w:jc w:val="left"/>
+            </w:pPr>
+            <w:r>
+              <w:t xml:space="preserve">Predicted exposure</w:t>
+            </w:r>
+            <w:r>
+              <w:t xml:space="preserve"> </w:t>
+            </w:r>
+            <m:oMath>
+              <m:acc>
+                <m:accPr>
+                  <m:chr m:val="‾"/>
+                </m:accPr>
+                <m:e>
+                  <m:r>
+                    <m:t>π</m:t>
+                  </m:r>
+                </m:e>
+              </m:acc>
+            </m:oMath>
+            <w:r>
+              <w:t xml:space="preserve"> </w:t>
+            </w:r>
+            <w:r>
+              <w:t xml:space="preserve">(median / max)</w:t>
+            </w:r>
+          </w:p>
+        </w:tc>
+        <w:tc>
+          <w:tcPr/>
+          <w:p>
+            <w:pPr>
+              <w:pStyle w:val="Compact"/>
+              <w:jc w:val="left"/>
+            </w:pPr>
+            <w:r>
+              <w:t xml:space="preserve">Datasets with label conflicts</w:t>
+            </w:r>
+          </w:p>
+        </w:tc>
+      </w:tr>
+      <w:tr>
+        <w:tc>
+          <w:tcPr/>
+          <w:p>
+            <w:pPr>
+              <w:pStyle w:val="Compact"/>
+              <w:jc w:val="left"/>
+            </w:pPr>
+            <w:r>
+              <w:t xml:space="preserve">Classification</w:t>
+            </w:r>
+          </w:p>
+        </w:tc>
+        <w:tc>
+          <w:tcPr/>
+          <w:p>
+            <w:pPr>
+              <w:pStyle w:val="Compact"/>
+              <w:jc w:val="left"/>
+            </w:pPr>
+            <w:r>
+              <w:t xml:space="preserve">DUP</w:t>
+            </w:r>
+          </w:p>
+        </w:tc>
+        <w:tc>
+          <w:tcPr/>
+          <w:p>
+            <w:pPr>
+              <w:pStyle w:val="Compact"/>
+              <w:jc w:val="left"/>
+            </w:pPr>
+            <w:r>
+              <w:t xml:space="preserve">24</w:t>
+            </w:r>
+          </w:p>
+        </w:tc>
+        <w:tc>
+          <w:tcPr/>
+          <w:p>
+            <w:pPr>
+              <w:pStyle w:val="Compact"/>
+              <w:jc w:val="left"/>
+            </w:pPr>
+            <w:r>
+              <w:t xml:space="preserve">2,054</w:t>
+            </w:r>
+          </w:p>
+        </w:tc>
+        <w:tc>
+          <w:tcPr/>
+          <w:p>
+            <w:pPr>
+              <w:pStyle w:val="Compact"/>
+              <w:jc w:val="left"/>
+            </w:pPr>
+            <w:r>
+              <w:t xml:space="preserve">13.4%</w:t>
+            </w:r>
+          </w:p>
+        </w:tc>
+        <w:tc>
+          <w:tcPr/>
+          <w:p>
+            <w:pPr>
+              <w:pStyle w:val="Compact"/>
+              <w:jc w:val="left"/>
+            </w:pPr>
+            <w:r>
+              <w:t xml:space="preserve">0.097 / 0.811</w:t>
+            </w:r>
+          </w:p>
+        </w:tc>
+        <w:tc>
+          <w:tcPr/>
+          <w:p>
+            <w:pPr>
+              <w:pStyle w:val="Compact"/>
+              <w:jc w:val="left"/>
+            </w:pPr>
+            <w:r>
+              <w:t xml:space="preserve">18</w:t>
+            </w:r>
+          </w:p>
+        </w:tc>
+      </w:tr>
+      <w:tr>
+        <w:tc>
+          <w:tcPr/>
+          <w:p>
+            <w:pPr>
+              <w:pStyle w:val="Compact"/>
+              <w:jc w:val="left"/>
+            </w:pPr>
+            <w:r>
+              <w:t xml:space="preserve">Classification</w:t>
+            </w:r>
+          </w:p>
+        </w:tc>
+        <w:tc>
+          <w:tcPr/>
+          <w:p>
+            <w:pPr>
+              <w:pStyle w:val="Compact"/>
+              <w:jc w:val="left"/>
+            </w:pPr>
+            <w:r>
+              <w:t xml:space="preserve">LOW</w:t>
+            </w:r>
+          </w:p>
+        </w:tc>
+        <w:tc>
+          <w:tcPr/>
+          <w:p>
+            <w:pPr>
+              <w:pStyle w:val="Compact"/>
+              <w:jc w:val="left"/>
+            </w:pPr>
+            <w:r>
+              <w:t xml:space="preserve">12</w:t>
+            </w:r>
+          </w:p>
+        </w:tc>
+        <w:tc>
+          <w:tcPr/>
+          <w:p>
+            <w:pPr>
+              <w:pStyle w:val="Compact"/>
+              <w:jc w:val="left"/>
+            </w:pPr>
+            <w:r>
+              <w:t xml:space="preserve">2,000</w:t>
+            </w:r>
+          </w:p>
+        </w:tc>
+        <w:tc>
+          <w:tcPr/>
+          <w:p>
+            <w:pPr>
+              <w:pStyle w:val="Compact"/>
+              <w:jc w:val="left"/>
+            </w:pPr>
+            <w:r>
+              <w:t xml:space="preserve">0.6%</w:t>
+            </w:r>
+          </w:p>
+        </w:tc>
+        <w:tc>
+          <w:tcPr/>
+          <w:p>
+            <w:pPr>
+              <w:pStyle w:val="Compact"/>
+              <w:jc w:val="left"/>
+            </w:pPr>
+            <w:r>
+              <w:t xml:space="preserve">0.004 / 0.006</w:t>
+            </w:r>
+          </w:p>
+        </w:tc>
+        <w:tc>
+          <w:tcPr/>
+          <w:p>
+            <w:pPr>
+              <w:pStyle w:val="Compact"/>
+              <w:jc w:val="left"/>
+            </w:pPr>
+            <w:r>
+              <w:t xml:space="preserve">2</w:t>
+            </w:r>
+          </w:p>
+        </w:tc>
+      </w:tr>
+      <w:tr>
+        <w:tc>
+          <w:tcPr/>
+          <w:p>
+            <w:pPr>
+              <w:pStyle w:val="Compact"/>
+              <w:jc w:val="left"/>
+            </w:pPr>
+            <w:r>
+              <w:t xml:space="preserve">Classification</w:t>
+            </w:r>
+          </w:p>
+        </w:tc>
+        <w:tc>
+          <w:tcPr/>
+          <w:p>
+            <w:pPr>
+              <w:pStyle w:val="Compact"/>
+              <w:jc w:val="left"/>
+            </w:pPr>
+            <w:r>
+              <w:t xml:space="preserve">CLEAN</w:t>
+            </w:r>
+          </w:p>
+        </w:tc>
+        <w:tc>
+          <w:tcPr/>
+          <w:p>
+            <w:pPr>
+              <w:pStyle w:val="Compact"/>
+              <w:jc w:val="left"/>
+            </w:pPr>
+            <w:r>
+              <w:t xml:space="preserve">32</w:t>
+            </w:r>
+          </w:p>
+        </w:tc>
+        <w:tc>
+          <w:tcPr/>
+          <w:p>
+            <w:pPr>
+              <w:pStyle w:val="Compact"/>
+              <w:jc w:val="left"/>
+            </w:pPr>
+            <w:r>
+              <w:t xml:space="preserve">2,270</w:t>
+            </w:r>
+          </w:p>
+        </w:tc>
+        <w:tc>
+          <w:tcPr/>
+          <w:p>
+            <w:pPr>
+              <w:pStyle w:val="Compact"/>
+              <w:jc w:val="left"/>
+            </w:pPr>
+            <w:r>
+              <w:t xml:space="preserve">0.0%</w:t>
+            </w:r>
+          </w:p>
+        </w:tc>
+        <w:tc>
+          <w:tcPr/>
+          <w:p>
+            <w:pPr>
+              <w:pStyle w:val="Compact"/>
+              <w:jc w:val="left"/>
+            </w:pPr>
+            <w:r>
+              <w:t xml:space="preserve">0.000 / 0.000</w:t>
+            </w:r>
+          </w:p>
+        </w:tc>
+        <w:tc>
+          <w:tcPr/>
+          <w:p>
+            <w:pPr>
+              <w:pStyle w:val="Compact"/>
+              <w:jc w:val="left"/>
+            </w:pPr>
+            <w:r>
+              <w:t xml:space="preserve">0</w:t>
+            </w:r>
+          </w:p>
+        </w:tc>
+      </w:tr>
+      <w:tr>
+        <w:tc>
+          <w:tcPr/>
+          <w:p>
+            <w:pPr>
+              <w:pStyle w:val="Compact"/>
+              <w:jc w:val="left"/>
+            </w:pPr>
+            <w:r>
+              <w:t xml:space="preserve">Regression</w:t>
+            </w:r>
+          </w:p>
+        </w:tc>
+        <w:tc>
+          <w:tcPr/>
+          <w:p>
+            <w:pPr>
+              <w:pStyle w:val="Compact"/>
+              <w:jc w:val="left"/>
+            </w:pPr>
+            <w:r>
+              <w:t xml:space="preserve">DUP</w:t>
+            </w:r>
+          </w:p>
+        </w:tc>
+        <w:tc>
+          <w:tcPr/>
+          <w:p>
+            <w:pPr>
+              <w:pStyle w:val="Compact"/>
+              <w:jc w:val="left"/>
+            </w:pPr>
+            <w:r>
+              <w:t xml:space="preserve">12</w:t>
+            </w:r>
+          </w:p>
+        </w:tc>
+        <w:tc>
+          <w:tcPr/>
+          <w:p>
+            <w:pPr>
+              <w:pStyle w:val="Compact"/>
+              <w:jc w:val="left"/>
+            </w:pPr>
+            <w:r>
+              <w:t xml:space="preserve">7,795</w:t>
+            </w:r>
+          </w:p>
+        </w:tc>
+        <w:tc>
+          <w:tcPr/>
+          <w:p>
+            <w:pPr>
+              <w:pStyle w:val="Compact"/>
+              <w:jc w:val="left"/>
+            </w:pPr>
+            <w:r>
+              <w:t xml:space="preserve">21.0%</w:t>
+            </w:r>
+          </w:p>
+        </w:tc>
+        <w:tc>
+          <w:tcPr/>
+          <w:p>
+            <w:pPr>
+              <w:pStyle w:val="Compact"/>
+              <w:jc w:val="left"/>
+            </w:pPr>
+            <w:r>
+              <w:t xml:space="preserve">0.144 / 0.853</w:t>
+            </w:r>
+          </w:p>
+        </w:tc>
+        <w:tc>
+          <w:tcPr/>
+          <w:p>
+            <w:pPr>
+              <w:pStyle w:val="Compact"/>
+              <w:jc w:val="left"/>
+            </w:pPr>
+            <w:r>
+              <w:t xml:space="preserve">10</w:t>
+            </w:r>
+          </w:p>
+        </w:tc>
+      </w:tr>
+      <w:tr>
+        <w:tc>
+          <w:tcPr/>
+          <w:p>
+            <w:pPr>
+              <w:pStyle w:val="Compact"/>
+              <w:jc w:val="left"/>
+            </w:pPr>
+            <w:r>
+              <w:t xml:space="preserve">Regression</w:t>
+            </w:r>
+          </w:p>
+        </w:tc>
+        <w:tc>
+          <w:tcPr/>
+          <w:p>
+            <w:pPr>
+              <w:pStyle w:val="Compact"/>
+              <w:jc w:val="left"/>
+            </w:pPr>
+            <w:r>
+              <w:t xml:space="preserve">LOW</w:t>
+            </w:r>
+          </w:p>
+        </w:tc>
+        <w:tc>
+          <w:tcPr/>
+          <w:p>
+            <w:pPr>
+              <w:pStyle w:val="Compact"/>
+              <w:jc w:val="left"/>
+            </w:pPr>
+            <w:r>
+              <w:t xml:space="preserve">5</w:t>
+            </w:r>
+          </w:p>
+        </w:tc>
+        <w:tc>
+          <w:tcPr/>
+          <w:p>
+            <w:pPr>
+              <w:pStyle w:val="Compact"/>
+              <w:jc w:val="left"/>
+            </w:pPr>
+            <w:r>
+              <w:t xml:space="preserve">21,613</w:t>
+            </w:r>
+          </w:p>
+        </w:tc>
+        <w:tc>
+          <w:tcPr/>
+          <w:p>
+            <w:pPr>
+              <w:pStyle w:val="Compact"/>
+              <w:jc w:val="left"/>
+            </w:pPr>
+            <w:r>
+              <w:t xml:space="preserve">0.2%</w:t>
+            </w:r>
+          </w:p>
+        </w:tc>
+        <w:tc>
+          <w:tcPr/>
+          <w:p>
+            <w:pPr>
+              <w:pStyle w:val="Compact"/>
+              <w:jc w:val="left"/>
+            </w:pPr>
+            <w:r>
+              <w:t xml:space="preserve">0.001 / 0.008</w:t>
+            </w:r>
+          </w:p>
+        </w:tc>
+        <w:tc>
+          <w:tcPr/>
+          <w:p>
+            <w:pPr>
+              <w:pStyle w:val="Compact"/>
+              <w:jc w:val="left"/>
+            </w:pPr>
+            <w:r>
+              <w:t xml:space="preserve">5</w:t>
+            </w:r>
+          </w:p>
+        </w:tc>
+      </w:tr>
+      <w:tr>
+        <w:tc>
+          <w:tcPr/>
+          <w:p>
+            <w:pPr>
+              <w:pStyle w:val="Compact"/>
+              <w:jc w:val="left"/>
+            </w:pPr>
+            <w:r>
+              <w:t xml:space="preserve">Regression</w:t>
+            </w:r>
+          </w:p>
+        </w:tc>
+        <w:tc>
+          <w:tcPr/>
+          <w:p>
+            <w:pPr>
+              <w:pStyle w:val="Compact"/>
+              <w:jc w:val="left"/>
+            </w:pPr>
+            <w:r>
+              <w:t xml:space="preserve">CLEAN</w:t>
+            </w:r>
+          </w:p>
+        </w:tc>
+        <w:tc>
+          <w:tcPr/>
+          <w:p>
+            <w:pPr>
+              <w:pStyle w:val="Compact"/>
+              <w:jc w:val="left"/>
+            </w:pPr>
+            <w:r>
+              <w:t xml:space="preserve">18</w:t>
+            </w:r>
+          </w:p>
+        </w:tc>
+        <w:tc>
+          <w:tcPr/>
+          <w:p>
+            <w:pPr>
+              <w:pStyle w:val="Compact"/>
+              <w:jc w:val="left"/>
+            </w:pPr>
+            <w:r>
+              <w:t xml:space="preserve">6,184</w:t>
+            </w:r>
+          </w:p>
+        </w:tc>
+        <w:tc>
+          <w:tcPr/>
+          <w:p>
+            <w:pPr>
+              <w:pStyle w:val="Compact"/>
+              <w:jc w:val="left"/>
+            </w:pPr>
+            <w:r>
+              <w:t xml:space="preserve">0.0%</w:t>
+            </w:r>
+          </w:p>
+        </w:tc>
+        <w:tc>
+          <w:tcPr/>
+          <w:p>
+            <w:pPr>
+              <w:pStyle w:val="Compact"/>
+              <w:jc w:val="left"/>
+            </w:pPr>
+            <w:r>
+              <w:t xml:space="preserve">0.000 / 0.000</w:t>
+            </w:r>
+          </w:p>
+        </w:tc>
+        <w:tc>
+          <w:tcPr/>
+          <w:p>
+            <w:pPr>
+              <w:pStyle w:val="Compact"/>
+              <w:jc w:val="left"/>
+            </w:pPr>
+            <w:r>
+              <w:t xml:space="preserve">0</w:t>
+            </w:r>
+          </w:p>
+        </w:tc>
+      </w:tr>
+    </w:tbl>
     <w:p>
       <w:pPr>
         <w:pStyle w:val="BodyText"/>
@@ -6231,7 +6958,7 @@
       </w:r>
     </w:p>
     <w:bookmarkEnd w:id="37"/>
-    <w:bookmarkStart w:id="41" w:name="Xd388141bdf573b79104bc8805c4f833ba44f9db"/>
+    <w:bookmarkStart w:id="41" w:name="Xa176ae986bcae8ab01f8ea49d7694e3b7a0eb32"/>
     <w:p>
       <w:pPr>
         <w:pStyle w:val="Heading2"/>
@@ -6246,7 +6973,7 @@
         <w:tab/>
       </w:r>
       <w:r>
-        <w:t xml:space="preserve">Pre-registered test: is novel-record coverage below nominal across duplicated datasets?</w:t>
+        <w:t xml:space="preserve">Pre-specified test: is novel-record coverage below nominal across duplicated datasets?</w:t>
       </w:r>
     </w:p>
     <w:p>
@@ -6304,7 +7031,7 @@
         <w:t xml:space="preserve"> </w:t>
       </w:r>
       <w:r>
-        <w:t xml:space="preserve">= 0.092). The pre-registered primary hypothesis, that the</w:t>
+        <w:t xml:space="preserve">= 0.092). The pre-specified primary hypothesis, that the</w:t>
       </w:r>
       <w:r>
         <w:t xml:space="preserve"> </w:t>
@@ -6328,7 +7055,7 @@
         <w:pStyle w:val="BodyText"/>
       </w:pPr>
       <w:r>
-        <w:t xml:space="preserve">The distribution of gaps is, however, strongly skewed. In every family the worst dataset under-covers novel records, by up to −6.9 pp in classification and −16.9 pp in regression. Between 4–42% of DUP datasets per family fall short by more than 1 pp. As H1a predicts, the gap grows with exposure: Spearman correlations between exposure and gap range from −0.84 to −0.11, and they are negative and significant (</w:t>
+        <w:t xml:space="preserve">The distribution of gaps is, however, strongly skewed. In every family the worst dataset under-covers novel records, by up to −6.9 pp in classification and −16.9 pp in regression. The share of DUP datasets that fall short by more than 1 pp ranges from 4–42% across families. As H1a predicts, the gap grows with exposure: Spearman correlations between exposure and gap range from −0.84 to −0.11, and they are negative and significant (</w:t>
       </w:r>
       <m:oMath>
         <m:r>
@@ -6345,7 +7072,7 @@
         </m:r>
       </m:oMath>
       <w:r>
-        <w:t xml:space="preserve">) in 10 of 16 families (Fig. 2). Overall coverage stays at nominal throughout (Table 2 and Online Resource 1), so the shortfall on novel records is invisible in the coverage that is normally reported.</w:t>
+        <w:t xml:space="preserve">) in 10 of 16 families (Fig. 2). Overall coverage stays at nominal throughout (Online Resource 1, Table S3b), so the shortfall on novel records is invisible in the coverage that is normally reported.</w:t>
       </w:r>
     </w:p>
     <w:p>
@@ -7658,7 +8385,7 @@
               <w:jc w:val="left"/>
             </w:pPr>
             <w:r>
-              <w:t xml:space="preserve">k−NN</w:t>
+              <w:t xml:space="preserve">k-NN</w:t>
             </w:r>
           </w:p>
         </w:tc>
@@ -7792,7 +8519,7 @@
               <w:jc w:val="left"/>
             </w:pPr>
             <w:r>
-              <w:t xml:space="preserve">k−NN</w:t>
+              <w:t xml:space="preserve">k-NN</w:t>
             </w:r>
           </w:p>
         </w:tc>
@@ -8182,7 +8909,7 @@
               <w:jc w:val="left"/>
             </w:pPr>
             <w:r>
-              <w:t xml:space="preserve">Regre.</w:t>
+              <w:t xml:space="preserve">Regr.</w:t>
             </w:r>
           </w:p>
         </w:tc>
@@ -8203,27 +8930,11 @@
           <w:p>
             <w:pPr>
               <w:pStyle w:val="Compact"/>
-            </w:pPr>
-          </w:p>
-        </w:tc>
-        <w:tc>
-          <w:tcPr/>
-          <w:p>
-            <w:pPr>
-              <w:pStyle w:val="Compact"/>
-              <w:jc w:val="left"/>
-            </w:pPr>
-            <w:r>
-              <w:t xml:space="preserve">res</w:t>
-            </w:r>
-          </w:p>
-        </w:tc>
-        <w:tc>
-          <w:tcPr/>
-          <w:p>
-            <w:pPr>
-              <w:pStyle w:val="Compact"/>
-            </w:pPr>
+              <w:jc w:val="left"/>
+            </w:pPr>
+            <w:r>
+              <w:t xml:space="preserve">Abs. res.</w:t>
+            </w:r>
           </w:p>
         </w:tc>
         <w:tc>
@@ -8295,6 +9006,30 @@
             </w:pPr>
             <w:r>
               <w:t xml:space="preserve">−0.00 [−0.49, +0.17]</w:t>
+            </w:r>
+          </w:p>
+        </w:tc>
+        <w:tc>
+          <w:tcPr/>
+          <w:p>
+            <w:pPr>
+              <w:pStyle w:val="Compact"/>
+              <w:jc w:val="left"/>
+            </w:pPr>
+            <w:r>
+              <w:t xml:space="preserve">0.154</w:t>
+            </w:r>
+          </w:p>
+        </w:tc>
+        <w:tc>
+          <w:tcPr/>
+          <w:p>
+            <w:pPr>
+              <w:pStyle w:val="Compact"/>
+              <w:jc w:val="left"/>
+            </w:pPr>
+            <w:r>
+              <w:t xml:space="preserve">1.026</w:t>
             </w:r>
           </w:p>
         </w:tc>
@@ -8308,7 +9043,7 @@
               <w:jc w:val="left"/>
             </w:pPr>
             <w:r>
-              <w:t xml:space="preserve">Regre.</w:t>
+              <w:t xml:space="preserve">Regr.</w:t>
             </w:r>
           </w:p>
         </w:tc>
@@ -8329,27 +9064,11 @@
           <w:p>
             <w:pPr>
               <w:pStyle w:val="Compact"/>
-            </w:pPr>
-          </w:p>
-        </w:tc>
-        <w:tc>
-          <w:tcPr/>
-          <w:p>
-            <w:pPr>
-              <w:pStyle w:val="Compact"/>
-              <w:jc w:val="left"/>
-            </w:pPr>
-            <w:r>
-              <w:t xml:space="preserve">res</w:t>
-            </w:r>
-          </w:p>
-        </w:tc>
-        <w:tc>
-          <w:tcPr/>
-          <w:p>
-            <w:pPr>
-              <w:pStyle w:val="Compact"/>
-            </w:pPr>
+              <w:jc w:val="left"/>
+            </w:pPr>
+            <w:r>
+              <w:t xml:space="preserve">Abs. res.</w:t>
+            </w:r>
           </w:p>
         </w:tc>
         <w:tc>
@@ -8421,6 +9140,30 @@
             </w:pPr>
             <w:r>
               <w:t xml:space="preserve">+0.01 [−0.18, +0.49]</w:t>
+            </w:r>
+          </w:p>
+        </w:tc>
+        <w:tc>
+          <w:tcPr/>
+          <w:p>
+            <w:pPr>
+              <w:pStyle w:val="Compact"/>
+              <w:jc w:val="left"/>
+            </w:pPr>
+            <w:r>
+              <w:t xml:space="preserve">0.107</w:t>
+            </w:r>
+          </w:p>
+        </w:tc>
+        <w:tc>
+          <w:tcPr/>
+          <w:p>
+            <w:pPr>
+              <w:pStyle w:val="Compact"/>
+              <w:jc w:val="left"/>
+            </w:pPr>
+            <w:r>
+              <w:t xml:space="preserve">1.043</w:t>
             </w:r>
           </w:p>
         </w:tc>
@@ -8434,7 +9177,7 @@
               <w:jc w:val="left"/>
             </w:pPr>
             <w:r>
-              <w:t xml:space="preserve">Regre.</w:t>
+              <w:t xml:space="preserve">Regr.</w:t>
             </w:r>
           </w:p>
         </w:tc>
@@ -8455,27 +9198,11 @@
           <w:p>
             <w:pPr>
               <w:pStyle w:val="Compact"/>
-            </w:pPr>
-          </w:p>
-        </w:tc>
-        <w:tc>
-          <w:tcPr/>
-          <w:p>
-            <w:pPr>
-              <w:pStyle w:val="Compact"/>
-              <w:jc w:val="left"/>
-            </w:pPr>
-            <w:r>
-              <w:t xml:space="preserve">res</w:t>
-            </w:r>
-          </w:p>
-        </w:tc>
-        <w:tc>
-          <w:tcPr/>
-          <w:p>
-            <w:pPr>
-              <w:pStyle w:val="Compact"/>
-            </w:pPr>
+              <w:jc w:val="left"/>
+            </w:pPr>
+            <w:r>
+              <w:t xml:space="preserve">Abs. res.</w:t>
+            </w:r>
           </w:p>
         </w:tc>
         <w:tc>
@@ -8547,6 +9274,30 @@
             </w:pPr>
             <w:r>
               <w:t xml:space="preserve">−0.03 [−0.15, +0.97]</w:t>
+            </w:r>
+          </w:p>
+        </w:tc>
+        <w:tc>
+          <w:tcPr/>
+          <w:p>
+            <w:pPr>
+              <w:pStyle w:val="Compact"/>
+              <w:jc w:val="left"/>
+            </w:pPr>
+            <w:r>
+              <w:t xml:space="preserve">0.061</w:t>
+            </w:r>
+          </w:p>
+        </w:tc>
+        <w:tc>
+          <w:tcPr/>
+          <w:p>
+            <w:pPr>
+              <w:pStyle w:val="Compact"/>
+              <w:jc w:val="left"/>
+            </w:pPr>
+            <w:r>
+              <w:t xml:space="preserve">1.027</w:t>
             </w:r>
           </w:p>
         </w:tc>
@@ -8560,48 +9311,32 @@
               <w:jc w:val="left"/>
             </w:pPr>
             <w:r>
-              <w:t xml:space="preserve">Regre.</w:t>
-            </w:r>
-          </w:p>
-        </w:tc>
-        <w:tc>
-          <w:tcPr/>
-          <w:p>
-            <w:pPr>
-              <w:pStyle w:val="Compact"/>
-              <w:jc w:val="left"/>
-            </w:pPr>
-            <w:r>
-              <w:t xml:space="preserve">k−NN</w:t>
-            </w:r>
-          </w:p>
-        </w:tc>
-        <w:tc>
-          <w:tcPr/>
-          <w:p>
-            <w:pPr>
-              <w:pStyle w:val="Compact"/>
-            </w:pPr>
-          </w:p>
-        </w:tc>
-        <w:tc>
-          <w:tcPr/>
-          <w:p>
-            <w:pPr>
-              <w:pStyle w:val="Compact"/>
-              <w:jc w:val="left"/>
-            </w:pPr>
-            <w:r>
-              <w:t xml:space="preserve">res</w:t>
-            </w:r>
-          </w:p>
-        </w:tc>
-        <w:tc>
-          <w:tcPr/>
-          <w:p>
-            <w:pPr>
-              <w:pStyle w:val="Compact"/>
-            </w:pPr>
+              <w:t xml:space="preserve">Regr.</w:t>
+            </w:r>
+          </w:p>
+        </w:tc>
+        <w:tc>
+          <w:tcPr/>
+          <w:p>
+            <w:pPr>
+              <w:pStyle w:val="Compact"/>
+              <w:jc w:val="left"/>
+            </w:pPr>
+            <w:r>
+              <w:t xml:space="preserve">k-NN</w:t>
+            </w:r>
+          </w:p>
+        </w:tc>
+        <w:tc>
+          <w:tcPr/>
+          <w:p>
+            <w:pPr>
+              <w:pStyle w:val="Compact"/>
+              <w:jc w:val="left"/>
+            </w:pPr>
+            <w:r>
+              <w:t xml:space="preserve">Abs. res.</w:t>
+            </w:r>
           </w:p>
         </w:tc>
         <w:tc>
@@ -8673,6 +9408,30 @@
             </w:pPr>
             <w:r>
               <w:t xml:space="preserve">+0.04 [−0.35, +1.02]</w:t>
+            </w:r>
+          </w:p>
+        </w:tc>
+        <w:tc>
+          <w:tcPr/>
+          <w:p>
+            <w:pPr>
+              <w:pStyle w:val="Compact"/>
+              <w:jc w:val="left"/>
+            </w:pPr>
+            <w:r>
+              <w:t xml:space="preserve">0.107</w:t>
+            </w:r>
+          </w:p>
+        </w:tc>
+        <w:tc>
+          <w:tcPr/>
+          <w:p>
+            <w:pPr>
+              <w:pStyle w:val="Compact"/>
+              <w:jc w:val="left"/>
+            </w:pPr>
+            <w:r>
+              <w:t xml:space="preserve">1.044</w:t>
             </w:r>
           </w:p>
         </w:tc>
@@ -8686,7 +9445,7 @@
               <w:jc w:val="left"/>
             </w:pPr>
             <w:r>
-              <w:t xml:space="preserve">Regre.</w:t>
+              <w:t xml:space="preserve">Regr.</w:t>
             </w:r>
           </w:p>
         </w:tc>
@@ -8707,27 +9466,11 @@
           <w:p>
             <w:pPr>
               <w:pStyle w:val="Compact"/>
-            </w:pPr>
-          </w:p>
-        </w:tc>
-        <w:tc>
-          <w:tcPr/>
-          <w:p>
-            <w:pPr>
-              <w:pStyle w:val="Compact"/>
-              <w:jc w:val="left"/>
-            </w:pPr>
-            <w:r>
-              <w:t xml:space="preserve">res</w:t>
-            </w:r>
-          </w:p>
-        </w:tc>
-        <w:tc>
-          <w:tcPr/>
-          <w:p>
-            <w:pPr>
-              <w:pStyle w:val="Compact"/>
-            </w:pPr>
+              <w:jc w:val="left"/>
+            </w:pPr>
+            <w:r>
+              <w:t xml:space="preserve">Abs. res.</w:t>
+            </w:r>
           </w:p>
         </w:tc>
         <w:tc>
@@ -8799,6 +9542,30 @@
             </w:pPr>
             <w:r>
               <w:t xml:space="preserve">−0.05 [−0.37, +0.22]</w:t>
+            </w:r>
+          </w:p>
+        </w:tc>
+        <w:tc>
+          <w:tcPr/>
+          <w:p>
+            <w:pPr>
+              <w:pStyle w:val="Compact"/>
+              <w:jc w:val="left"/>
+            </w:pPr>
+            <w:r>
+              <w:t xml:space="preserve">0.154</w:t>
+            </w:r>
+          </w:p>
+        </w:tc>
+        <w:tc>
+          <w:tcPr/>
+          <w:p>
+            <w:pPr>
+              <w:pStyle w:val="Compact"/>
+              <w:jc w:val="left"/>
+            </w:pPr>
+            <w:r>
+              <w:t xml:space="preserve">1.027</w:t>
             </w:r>
           </w:p>
         </w:tc>
@@ -8812,7 +9579,7 @@
               <w:jc w:val="left"/>
             </w:pPr>
             <w:r>
-              <w:t xml:space="preserve">Regre.</w:t>
+              <w:t xml:space="preserve">Regr.</w:t>
             </w:r>
           </w:p>
         </w:tc>
@@ -9172,7 +9939,7 @@
         <w:pStyle w:val="BodyText"/>
       </w:pPr>
       <w:r>
-        <w:t xml:space="preserve">The decomposition of Proposition 1 shows which datasets fail (Fig. 8). The seen-coverage term</w:t>
+        <w:t xml:space="preserve">The decomposition of Proposition 1 shows which datasets fail (Fig. 3). The seen-coverage term</w:t>
       </w:r>
       <w:r>
         <w:t xml:space="preserve"> </w:t>
@@ -9347,7 +10114,7 @@
         <w:t xml:space="preserve">cps88wages</w:t>
       </w:r>
       <w:r>
-        <w:t xml:space="preserve">, which has the same exposure but conflicting labels in almost every duplicate group, seen records are covered at the nominal rate (0.90–0.90) and novel records do not fall short (0.89–0.91). Large gaps also occur where duplicates mostly carry consistent labels, as in the NASA defect data (</w:t>
+        <w:t xml:space="preserve">, which has the same exposure but conflicting labels in almost every duplicate group, seen records are covered at the nominal rate (0.90) and novel records do not fall short (0.89–0.91). Large gaps also occur where duplicates mostly carry consistent labels, as in the NASA defect data (</w:t>
       </w:r>
       <w:r>
         <w:rPr>
@@ -9669,27 +10436,11 @@
           <w:p>
             <w:pPr>
               <w:pStyle w:val="Compact"/>
-            </w:pPr>
-          </w:p>
-        </w:tc>
-        <w:tc>
-          <w:tcPr/>
-          <w:p>
-            <w:pPr>
-              <w:pStyle w:val="Compact"/>
-              <w:jc w:val="left"/>
-            </w:pPr>
-            <w:r>
-              <w:t xml:space="preserve">res</w:t>
-            </w:r>
-          </w:p>
-        </w:tc>
-        <w:tc>
-          <w:tcPr/>
-          <w:p>
-            <w:pPr>
-              <w:pStyle w:val="Compact"/>
-            </w:pPr>
+              <w:jc w:val="left"/>
+            </w:pPr>
+            <w:r>
+              <w:t xml:space="preserve">Abs. res.</w:t>
+            </w:r>
           </w:p>
         </w:tc>
         <w:tc>
@@ -9761,6 +10512,30 @@
             </w:pPr>
             <w:r>
               <w:t xml:space="preserve">0</w:t>
+            </w:r>
+          </w:p>
+        </w:tc>
+        <w:tc>
+          <w:tcPr/>
+          <w:p>
+            <w:pPr>
+              <w:pStyle w:val="Compact"/>
+              <w:jc w:val="left"/>
+            </w:pPr>
+            <w:r>
+              <w:t xml:space="preserve">+0.17</w:t>
+            </w:r>
+          </w:p>
+        </w:tc>
+        <w:tc>
+          <w:tcPr/>
+          <w:p>
+            <w:pPr>
+              <w:pStyle w:val="Compact"/>
+              <w:jc w:val="left"/>
+            </w:pPr>
+            <w:r>
+              <w:t xml:space="preserve">−0.5</w:t>
             </w:r>
           </w:p>
         </w:tc>
@@ -9786,7 +10561,7 @@
               <w:jc w:val="left"/>
             </w:pPr>
             <w:r>
-              <w:t xml:space="preserve">aps</w:t>
+              <w:t xml:space="preserve">APS</w:t>
             </w:r>
           </w:p>
         </w:tc>
@@ -9908,7 +10683,7 @@
               <w:jc w:val="left"/>
             </w:pPr>
             <w:r>
-              <w:t xml:space="preserve">cqr</w:t>
+              <w:t xml:space="preserve">CQR</w:t>
             </w:r>
           </w:p>
         </w:tc>
@@ -10030,7 +10805,7 @@
               <w:jc w:val="left"/>
             </w:pPr>
             <w:r>
-              <w:t xml:space="preserve">lac</w:t>
+              <w:t xml:space="preserve">LAC</w:t>
             </w:r>
           </w:p>
         </w:tc>
@@ -10149,27 +10924,11 @@
           <w:p>
             <w:pPr>
               <w:pStyle w:val="Compact"/>
-            </w:pPr>
-          </w:p>
-        </w:tc>
-        <w:tc>
-          <w:tcPr/>
-          <w:p>
-            <w:pPr>
-              <w:pStyle w:val="Compact"/>
-              <w:jc w:val="left"/>
-            </w:pPr>
-            <w:r>
-              <w:t xml:space="preserve">res</w:t>
-            </w:r>
-          </w:p>
-        </w:tc>
-        <w:tc>
-          <w:tcPr/>
-          <w:p>
-            <w:pPr>
-              <w:pStyle w:val="Compact"/>
-            </w:pPr>
+              <w:jc w:val="left"/>
+            </w:pPr>
+            <w:r>
+              <w:t xml:space="preserve">Abs. res.</w:t>
+            </w:r>
           </w:p>
         </w:tc>
         <w:tc>
@@ -10241,6 +11000,30 @@
             </w:pPr>
             <w:r>
               <w:t xml:space="preserve">15</w:t>
+            </w:r>
+          </w:p>
+        </w:tc>
+        <w:tc>
+          <w:tcPr/>
+          <w:p>
+            <w:pPr>
+              <w:pStyle w:val="Compact"/>
+              <w:jc w:val="left"/>
+            </w:pPr>
+            <w:r>
+              <w:t xml:space="preserve">−0.07</w:t>
+            </w:r>
+          </w:p>
+        </w:tc>
+        <w:tc>
+          <w:tcPr/>
+          <w:p>
+            <w:pPr>
+              <w:pStyle w:val="Compact"/>
+              <w:jc w:val="left"/>
+            </w:pPr>
+            <w:r>
+              <w:t xml:space="preserve">−0.6</w:t>
             </w:r>
           </w:p>
         </w:tc>
@@ -10266,7 +11049,7 @@
               <w:jc w:val="left"/>
             </w:pPr>
             <w:r>
-              <w:t xml:space="preserve">aps</w:t>
+              <w:t xml:space="preserve">APS</w:t>
             </w:r>
           </w:p>
         </w:tc>
@@ -10388,7 +11171,7 @@
               <w:jc w:val="left"/>
             </w:pPr>
             <w:r>
-              <w:t xml:space="preserve">cqr</w:t>
+              <w:t xml:space="preserve">CQR</w:t>
             </w:r>
           </w:p>
         </w:tc>
@@ -10510,7 +11293,7 @@
               <w:jc w:val="left"/>
             </w:pPr>
             <w:r>
-              <w:t xml:space="preserve">lac</w:t>
+              <w:t xml:space="preserve">LAC</w:t>
             </w:r>
           </w:p>
         </w:tc>
@@ -10620,36 +11403,20 @@
               <w:jc w:val="left"/>
             </w:pPr>
             <w:r>
-              <w:t xml:space="preserve">π&gt;=0.3</w:t>
-            </w:r>
-          </w:p>
-        </w:tc>
-        <w:tc>
-          <w:tcPr/>
-          <w:p>
-            <w:pPr>
-              <w:pStyle w:val="Compact"/>
-            </w:pPr>
-          </w:p>
-        </w:tc>
-        <w:tc>
-          <w:tcPr/>
-          <w:p>
-            <w:pPr>
-              <w:pStyle w:val="Compact"/>
-              <w:jc w:val="left"/>
-            </w:pPr>
-            <w:r>
-              <w:t xml:space="preserve">res</w:t>
-            </w:r>
-          </w:p>
-        </w:tc>
-        <w:tc>
-          <w:tcPr/>
-          <w:p>
-            <w:pPr>
-              <w:pStyle w:val="Compact"/>
-            </w:pPr>
+              <w:t xml:space="preserve">π≥0.3</w:t>
+            </w:r>
+          </w:p>
+        </w:tc>
+        <w:tc>
+          <w:tcPr/>
+          <w:p>
+            <w:pPr>
+              <w:pStyle w:val="Compact"/>
+              <w:jc w:val="left"/>
+            </w:pPr>
+            <w:r>
+              <w:t xml:space="preserve">Abs. res.</w:t>
+            </w:r>
           </w:p>
         </w:tc>
         <w:tc>
@@ -10721,6 +11488,30 @@
             </w:pPr>
             <w:r>
               <w:t xml:space="preserve">33</w:t>
+            </w:r>
+          </w:p>
+        </w:tc>
+        <w:tc>
+          <w:tcPr/>
+          <w:p>
+            <w:pPr>
+              <w:pStyle w:val="Compact"/>
+              <w:jc w:val="left"/>
+            </w:pPr>
+            <w:r>
+              <w:t xml:space="preserve">−0.17</w:t>
+            </w:r>
+          </w:p>
+        </w:tc>
+        <w:tc>
+          <w:tcPr/>
+          <w:p>
+            <w:pPr>
+              <w:pStyle w:val="Compact"/>
+              <w:jc w:val="left"/>
+            </w:pPr>
+            <w:r>
+              <w:t xml:space="preserve">−5.8</w:t>
             </w:r>
           </w:p>
         </w:tc>
@@ -10734,19 +11525,19 @@
               <w:jc w:val="left"/>
             </w:pPr>
             <w:r>
-              <w:t xml:space="preserve">π&gt;=0.3</w:t>
-            </w:r>
-          </w:p>
-        </w:tc>
-        <w:tc>
-          <w:tcPr/>
-          <w:p>
-            <w:pPr>
-              <w:pStyle w:val="Compact"/>
-              <w:jc w:val="left"/>
-            </w:pPr>
-            <w:r>
-              <w:t xml:space="preserve">aps</w:t>
+              <w:t xml:space="preserve">π≥0.3</w:t>
+            </w:r>
+          </w:p>
+        </w:tc>
+        <w:tc>
+          <w:tcPr/>
+          <w:p>
+            <w:pPr>
+              <w:pStyle w:val="Compact"/>
+              <w:jc w:val="left"/>
+            </w:pPr>
+            <w:r>
+              <w:t xml:space="preserve">APS</w:t>
             </w:r>
           </w:p>
         </w:tc>
@@ -10856,19 +11647,19 @@
               <w:jc w:val="left"/>
             </w:pPr>
             <w:r>
-              <w:t xml:space="preserve">π&gt;=0.3</w:t>
-            </w:r>
-          </w:p>
-        </w:tc>
-        <w:tc>
-          <w:tcPr/>
-          <w:p>
-            <w:pPr>
-              <w:pStyle w:val="Compact"/>
-              <w:jc w:val="left"/>
-            </w:pPr>
-            <w:r>
-              <w:t xml:space="preserve">cqr</w:t>
+              <w:t xml:space="preserve">π≥0.3</w:t>
+            </w:r>
+          </w:p>
+        </w:tc>
+        <w:tc>
+          <w:tcPr/>
+          <w:p>
+            <w:pPr>
+              <w:pStyle w:val="Compact"/>
+              <w:jc w:val="left"/>
+            </w:pPr>
+            <w:r>
+              <w:t xml:space="preserve">CQR</w:t>
             </w:r>
           </w:p>
         </w:tc>
@@ -10978,19 +11769,19 @@
               <w:jc w:val="left"/>
             </w:pPr>
             <w:r>
-              <w:t xml:space="preserve">π&gt;=0.3</w:t>
-            </w:r>
-          </w:p>
-        </w:tc>
-        <w:tc>
-          <w:tcPr/>
-          <w:p>
-            <w:pPr>
-              <w:pStyle w:val="Compact"/>
-              <w:jc w:val="left"/>
-            </w:pPr>
-            <w:r>
-              <w:t xml:space="preserve">lac</w:t>
+              <w:t xml:space="preserve">π≥0.3</w:t>
+            </w:r>
+          </w:p>
+        </w:tc>
+        <w:tc>
+          <w:tcPr/>
+          <w:p>
+            <w:pPr>
+              <w:pStyle w:val="Compact"/>
+              <w:jc w:val="left"/>
+            </w:pPr>
+            <w:r>
+              <w:t xml:space="preserve">LAC</w:t>
             </w:r>
           </w:p>
         </w:tc>
@@ -11101,12 +11892,12 @@
           <wp:inline>
             <wp:extent cx="5334000" cy="1929430"/>
             <wp:effectExtent b="0" l="0" r="0" t="0"/>
-            <wp:docPr descr="Fig. 8 Exploratory. (a) Observed novel-record gap of split CP versus the seen-coverage term of Proposition 1 for every duplicated dataset × learner × score (dashed line: identity; vertical deviations equal the marginal term). (b) Coverage of seen test records versus exposure; values are noisy where few test rows are seen" title="" id="43" name="Picture"/>
+            <wp:docPr descr="Fig. 3 Exploratory. (a) Observed novel-record gap of split CP versus the seen-coverage term of Proposition 1 for every duplicated dataset × learner × score (dashed line: identity; vertical deviations equal the marginal term). (b) Coverage of seen test records versus exposure; values are noisy where few test rows are seen" title="" id="43" name="Picture"/>
             <a:graphic>
               <a:graphicData uri="http://schemas.openxmlformats.org/drawingml/2006/picture">
                 <pic:pic>
                   <pic:nvPicPr>
-                    <pic:cNvPr descr="Fig8.png" id="44" name="Picture"/>
+                    <pic:cNvPr descr="Fig3.png" id="44" name="Picture"/>
                     <pic:cNvPicPr>
                       <a:picLocks noChangeArrowheads="1" noChangeAspect="1"/>
                     </pic:cNvPicPr>
@@ -11148,7 +11939,7 @@
           <w:bCs/>
           <w:b/>
         </w:rPr>
-        <w:t xml:space="preserve">Fig. 8</w:t>
+        <w:t xml:space="preserve">Fig. 3</w:t>
       </w:r>
       <w:r>
         <w:t xml:space="preserve"> </w:t>
@@ -11158,7 +11949,7 @@
       </w:r>
     </w:p>
     <w:bookmarkEnd w:id="45"/>
-    <w:bookmarkStart w:id="52" w:name="controlled-experiments-1"/>
+    <w:bookmarkStart w:id="46" w:name="Xc62ed72f6dbff5a00480f439b6d224392d53f08"/>
     <w:p>
       <w:pPr>
         <w:pStyle w:val="Heading2"/>
@@ -11168,6 +11959,929 @@
           <w:rStyle w:val="SectionNumber"/>
         </w:rPr>
         <w:t xml:space="preserve">5.4</w:t>
+      </w:r>
+      <w:r>
+        <w:tab/>
+      </w:r>
+      <w:r>
+        <w:t xml:space="preserve">External validation on data with documented duplication</w:t>
+      </w:r>
+    </w:p>
+    <w:p>
+      <w:pPr>
+        <w:pStyle w:val="FirstParagraph"/>
+      </w:pPr>
+      <w:r>
+        <w:t xml:space="preserve">The two curated suites contain few highly exposed datasets, and CTR23 excludes datasets that require grouped splits. After the first review round we therefore specified an external set before any outcome on it was computed (Online Resource 1, Table S2): every NASA MDP software-defect dataset on OpenML that is not in CC18 and has at least 300 rows, plus the 10% KDD Cup’99 intrusion data, whose redundancy is well documented (Tavallaee et al. 2009). The analysis used the same configuration as the main grid. Four of the 5 datasets have high exposure and almost no conflicting labels (Table 5).</w:t>
+      </w:r>
+    </w:p>
+    <w:p>
+      <w:pPr>
+        <w:pStyle w:val="BodyText"/>
+      </w:pPr>
+      <w:r>
+        <w:t xml:space="preserve">In these data the shortfall is large and consistent. Of the 25 dataset × learner combinations (LAC score,</w:t>
+      </w:r>
+      <w:r>
+        <w:t xml:space="preserve"> </w:t>
+      </w:r>
+      <m:oMath>
+        <m:r>
+          <m:t>α</m:t>
+        </m:r>
+        <m:r>
+          <m:rPr>
+            <m:sty m:val="p"/>
+          </m:rPr>
+          <m:t>=</m:t>
+        </m:r>
+        <m:r>
+          <m:t>0.1</m:t>
+        </m:r>
+      </m:oMath>
+      <w:r>
+        <w:t xml:space="preserve">), split CP under-covers novel records with a seed-level 95% confidence interval entirely below zero in 11, and entirely below −2 pp in 9. The worst mean gap is −27.5 pp. Novelty-Mondrian CP restores at least nominal coverage on novel records: its worst mean gap is −2.1 pp, and none of its confidence intervals lies entirely below zero. On KDD Cup’99, both methods over-cover with several learners (overall coverage up to 0.99). The thousands of identical calibration rows produce tied scores, which, as noted in the theory, preserve the lower coverage bound but not the upper one. In the suite datasets with</w:t>
+      </w:r>
+      <w:r>
+        <w:t xml:space="preserve"> </w:t>
+      </w:r>
+      <m:oMath>
+        <m:acc>
+          <m:accPr>
+            <m:chr m:val="‾"/>
+          </m:accPr>
+          <m:e>
+            <m:r>
+              <m:t>π</m:t>
+            </m:r>
+          </m:e>
+        </m:acc>
+        <m:r>
+          <m:rPr>
+            <m:sty m:val="p"/>
+          </m:rPr>
+          <m:t>≥</m:t>
+        </m:r>
+        <m:r>
+          <m:t>0.3</m:t>
+        </m:r>
+      </m:oMath>
+      <w:r>
+        <w:t xml:space="preserve">, seed-level intervals for split CP lie entirely below zero in 20 of 45 combinations (13 below −2 pp), and for novelty-Mondrian CP in 1.</w:t>
+      </w:r>
+    </w:p>
+    <w:p>
+      <w:pPr>
+        <w:pStyle w:val="BodyText"/>
+      </w:pPr>
+      <w:r>
+        <w:rPr>
+          <w:bCs/>
+          <w:b/>
+        </w:rPr>
+        <w:t xml:space="preserve">Table 5</w:t>
+      </w:r>
+      <w:r>
+        <w:t xml:space="preserve"> </w:t>
+      </w:r>
+      <w:r>
+        <w:t xml:space="preserve">External validation (classification, LAC,</w:t>
+      </w:r>
+      <w:r>
+        <w:t xml:space="preserve"> </w:t>
+      </w:r>
+      <m:oMath>
+        <m:r>
+          <m:t>α</m:t>
+        </m:r>
+        <m:r>
+          <m:rPr>
+            <m:sty m:val="p"/>
+          </m:rPr>
+          <m:t>=</m:t>
+        </m:r>
+        <m:r>
+          <m:t>0.1</m:t>
+        </m:r>
+      </m:oMath>
+      <w:r>
+        <w:t xml:space="preserve">): novel-record coverage gap of split CP (pp; mean over 10 splits [seed-level 95% CI]) and range of the novelty-Mondrian CP gap across learners.</w:t>
+      </w:r>
+      <w:r>
+        <w:t xml:space="preserve"> </w:t>
+      </w:r>
+      <w:r>
+        <w:t xml:space="preserve">“</w:t>
+      </w:r>
+      <w:r>
+        <w:t xml:space="preserve">Rows</w:t>
+      </w:r>
+      <w:r>
+        <w:t xml:space="preserve">”</w:t>
+      </w:r>
+      <w:r>
+        <w:t xml:space="preserve"> </w:t>
+      </w:r>
+      <w:r>
+        <w:t xml:space="preserve">is the original size; KDD Cup’99 was uniformly subsampled to 30,000 rows, on which the duplicate share and</w:t>
+      </w:r>
+      <w:r>
+        <w:t xml:space="preserve"> </w:t>
+      </w:r>
+      <m:oMath>
+        <m:acc>
+          <m:accPr>
+            <m:chr m:val="‾"/>
+          </m:accPr>
+          <m:e>
+            <m:r>
+              <m:t>π</m:t>
+            </m:r>
+          </m:e>
+        </m:acc>
+      </m:oMath>
+      <w:r>
+        <w:t xml:space="preserve"> </w:t>
+      </w:r>
+      <w:r>
+        <w:t xml:space="preserve">are computed</w:t>
+      </w:r>
+    </w:p>
+    <w:tbl>
+      <w:tblPr>
+        <w:tblStyle w:val="Table"/>
+        <w:tblW w:type="pct" w:w="5000"/>
+        <w:tblLook w:firstRow="1" w:lastRow="0" w:firstColumn="0" w:lastColumn="0" w:noHBand="0" w:noVBand="0" w:val="0020"/>
+        <w:jc w:val="start"/>
+      </w:tblPr>
+      <w:tblGrid>
+        <w:gridCol w:w="792"/>
+        <w:gridCol w:w="792"/>
+        <w:gridCol w:w="792"/>
+        <w:gridCol w:w="792"/>
+        <w:gridCol w:w="792"/>
+        <w:gridCol w:w="792"/>
+        <w:gridCol w:w="792"/>
+        <w:gridCol w:w="792"/>
+        <w:gridCol w:w="792"/>
+        <w:gridCol w:w="792"/>
+      </w:tblGrid>
+      <w:tr>
+        <w:trPr>
+          <w:tblHeader w:val="true"/>
+        </w:trPr>
+        <w:tc>
+          <w:tcPr/>
+          <w:p>
+            <w:pPr>
+              <w:pStyle w:val="Compact"/>
+              <w:jc w:val="left"/>
+            </w:pPr>
+            <w:r>
+              <w:t xml:space="preserve">Dataset</w:t>
+            </w:r>
+          </w:p>
+        </w:tc>
+        <w:tc>
+          <w:tcPr/>
+          <w:p>
+            <w:pPr>
+              <w:pStyle w:val="Compact"/>
+              <w:jc w:val="left"/>
+            </w:pPr>
+            <w:r>
+              <w:t xml:space="preserve">Rows</w:t>
+            </w:r>
+          </w:p>
+        </w:tc>
+        <w:tc>
+          <w:tcPr/>
+          <w:p>
+            <w:pPr>
+              <w:pStyle w:val="Compact"/>
+              <w:jc w:val="left"/>
+            </w:pPr>
+            <w:r>
+              <w:t xml:space="preserve">Rows in duplicate groups</w:t>
+            </w:r>
+          </w:p>
+        </w:tc>
+        <w:tc>
+          <w:tcPr/>
+          <w:p>
+            <w:pPr>
+              <w:pStyle w:val="Compact"/>
+              <w:jc w:val="left"/>
+            </w:pPr>
+            <m:oMath>
+              <m:acc>
+                <m:accPr>
+                  <m:chr m:val="‾"/>
+                </m:accPr>
+                <m:e>
+                  <m:r>
+                    <m:t>π</m:t>
+                  </m:r>
+                </m:e>
+              </m:acc>
+            </m:oMath>
+          </w:p>
+        </w:tc>
+        <w:tc>
+          <w:tcPr/>
+          <w:p>
+            <w:pPr>
+              <w:pStyle w:val="Compact"/>
+              <w:jc w:val="left"/>
+            </w:pPr>
+            <w:r>
+              <w:t xml:space="preserve">LR</w:t>
+            </w:r>
+          </w:p>
+        </w:tc>
+        <w:tc>
+          <w:tcPr/>
+          <w:p>
+            <w:pPr>
+              <w:pStyle w:val="Compact"/>
+              <w:jc w:val="left"/>
+            </w:pPr>
+            <w:r>
+              <w:t xml:space="preserve">RF</w:t>
+            </w:r>
+          </w:p>
+        </w:tc>
+        <w:tc>
+          <w:tcPr/>
+          <w:p>
+            <w:pPr>
+              <w:pStyle w:val="Compact"/>
+              <w:jc w:val="left"/>
+            </w:pPr>
+            <w:r>
+              <w:t xml:space="preserve">LightGBM</w:t>
+            </w:r>
+          </w:p>
+        </w:tc>
+        <w:tc>
+          <w:tcPr/>
+          <w:p>
+            <w:pPr>
+              <w:pStyle w:val="Compact"/>
+              <w:jc w:val="left"/>
+            </w:pPr>
+            <w:r>
+              <w:t xml:space="preserve">k-NN</w:t>
+            </w:r>
+          </w:p>
+        </w:tc>
+        <w:tc>
+          <w:tcPr/>
+          <w:p>
+            <w:pPr>
+              <w:pStyle w:val="Compact"/>
+              <w:jc w:val="left"/>
+            </w:pPr>
+            <w:r>
+              <w:t xml:space="preserve">MLP</w:t>
+            </w:r>
+          </w:p>
+        </w:tc>
+        <w:tc>
+          <w:tcPr/>
+          <w:p>
+            <w:pPr>
+              <w:pStyle w:val="Compact"/>
+              <w:jc w:val="left"/>
+            </w:pPr>
+            <w:r>
+              <w:t xml:space="preserve">MCP-R range</w:t>
+            </w:r>
+          </w:p>
+        </w:tc>
+      </w:tr>
+      <w:tr>
+        <w:tc>
+          <w:tcPr/>
+          <w:p>
+            <w:pPr>
+              <w:pStyle w:val="Compact"/>
+              <w:jc w:val="left"/>
+            </w:pPr>
+            <w:r>
+              <w:t xml:space="preserve">mc1</w:t>
+            </w:r>
+          </w:p>
+        </w:tc>
+        <w:tc>
+          <w:tcPr/>
+          <w:p>
+            <w:pPr>
+              <w:pStyle w:val="Compact"/>
+              <w:jc w:val="left"/>
+            </w:pPr>
+            <w:r>
+              <w:t xml:space="preserve">9,466</w:t>
+            </w:r>
+          </w:p>
+        </w:tc>
+        <w:tc>
+          <w:tcPr/>
+          <w:p>
+            <w:pPr>
+              <w:pStyle w:val="Compact"/>
+              <w:jc w:val="left"/>
+            </w:pPr>
+            <w:r>
+              <w:t xml:space="preserve">84%</w:t>
+            </w:r>
+          </w:p>
+        </w:tc>
+        <w:tc>
+          <w:tcPr/>
+          <w:p>
+            <w:pPr>
+              <w:pStyle w:val="Compact"/>
+              <w:jc w:val="left"/>
+            </w:pPr>
+            <w:r>
+              <w:t xml:space="preserve">0.82</w:t>
+            </w:r>
+          </w:p>
+        </w:tc>
+        <w:tc>
+          <w:tcPr/>
+          <w:p>
+            <w:pPr>
+              <w:pStyle w:val="Compact"/>
+              <w:jc w:val="left"/>
+            </w:pPr>
+            <w:r>
+              <w:t xml:space="preserve">−17.5 [−19.5, −15.5]</w:t>
+            </w:r>
+          </w:p>
+        </w:tc>
+        <w:tc>
+          <w:tcPr/>
+          <w:p>
+            <w:pPr>
+              <w:pStyle w:val="Compact"/>
+              <w:jc w:val="left"/>
+            </w:pPr>
+            <w:r>
+              <w:t xml:space="preserve">−27.3 [−30.2, −24.4]</w:t>
+            </w:r>
+          </w:p>
+        </w:tc>
+        <w:tc>
+          <w:tcPr/>
+          <w:p>
+            <w:pPr>
+              <w:pStyle w:val="Compact"/>
+              <w:jc w:val="left"/>
+            </w:pPr>
+            <w:r>
+              <w:t xml:space="preserve">−19.9 [−23.1, −16.6]</w:t>
+            </w:r>
+          </w:p>
+        </w:tc>
+        <w:tc>
+          <w:tcPr/>
+          <w:p>
+            <w:pPr>
+              <w:pStyle w:val="Compact"/>
+              <w:jc w:val="left"/>
+            </w:pPr>
+            <w:r>
+              <w:t xml:space="preserve">+3.0 [+2.1, +3.9]</w:t>
+            </w:r>
+          </w:p>
+        </w:tc>
+        <w:tc>
+          <w:tcPr/>
+          <w:p>
+            <w:pPr>
+              <w:pStyle w:val="Compact"/>
+              <w:jc w:val="left"/>
+            </w:pPr>
+            <w:r>
+              <w:t xml:space="preserve">−16.9 [−21.3, −12.6]</w:t>
+            </w:r>
+          </w:p>
+        </w:tc>
+        <w:tc>
+          <w:tcPr/>
+          <w:p>
+            <w:pPr>
+              <w:pStyle w:val="Compact"/>
+              <w:jc w:val="left"/>
+            </w:pPr>
+            <w:r>
+              <w:t xml:space="preserve">−0.6 to +3.0</w:t>
+            </w:r>
+          </w:p>
+        </w:tc>
+      </w:tr>
+      <w:tr>
+        <w:tc>
+          <w:tcPr/>
+          <w:p>
+            <w:pPr>
+              <w:pStyle w:val="Compact"/>
+              <w:jc w:val="left"/>
+            </w:pPr>
+            <w:r>
+              <w:t xml:space="preserve">kc3</w:t>
+            </w:r>
+          </w:p>
+        </w:tc>
+        <w:tc>
+          <w:tcPr/>
+          <w:p>
+            <w:pPr>
+              <w:pStyle w:val="Compact"/>
+              <w:jc w:val="left"/>
+            </w:pPr>
+            <w:r>
+              <w:t xml:space="preserve">458</w:t>
+            </w:r>
+          </w:p>
+        </w:tc>
+        <w:tc>
+          <w:tcPr/>
+          <w:p>
+            <w:pPr>
+              <w:pStyle w:val="Compact"/>
+              <w:jc w:val="left"/>
+            </w:pPr>
+            <w:r>
+              <w:t xml:space="preserve">38%</w:t>
+            </w:r>
+          </w:p>
+        </w:tc>
+        <w:tc>
+          <w:tcPr/>
+          <w:p>
+            <w:pPr>
+              <w:pStyle w:val="Compact"/>
+              <w:jc w:val="left"/>
+            </w:pPr>
+            <w:r>
+              <w:t xml:space="preserve">0.33</w:t>
+            </w:r>
+          </w:p>
+        </w:tc>
+        <w:tc>
+          <w:tcPr/>
+          <w:p>
+            <w:pPr>
+              <w:pStyle w:val="Compact"/>
+              <w:jc w:val="left"/>
+            </w:pPr>
+            <w:r>
+              <w:t xml:space="preserve">+0.8 [−1.9, +3.5]</w:t>
+            </w:r>
+          </w:p>
+        </w:tc>
+        <w:tc>
+          <w:tcPr/>
+          <w:p>
+            <w:pPr>
+              <w:pStyle w:val="Compact"/>
+              <w:jc w:val="left"/>
+            </w:pPr>
+            <w:r>
+              <w:t xml:space="preserve">−0.2 [−3.6, +3.2]</w:t>
+            </w:r>
+          </w:p>
+        </w:tc>
+        <w:tc>
+          <w:tcPr/>
+          <w:p>
+            <w:pPr>
+              <w:pStyle w:val="Compact"/>
+              <w:jc w:val="left"/>
+            </w:pPr>
+            <w:r>
+              <w:t xml:space="preserve">−0.7 [−3.7, +2.4]</w:t>
+            </w:r>
+          </w:p>
+        </w:tc>
+        <w:tc>
+          <w:tcPr/>
+          <w:p>
+            <w:pPr>
+              <w:pStyle w:val="Compact"/>
+              <w:jc w:val="left"/>
+            </w:pPr>
+            <w:r>
+              <w:t xml:space="preserve">+0.9 [−2.0, +3.9]</w:t>
+            </w:r>
+          </w:p>
+        </w:tc>
+        <w:tc>
+          <w:tcPr/>
+          <w:p>
+            <w:pPr>
+              <w:pStyle w:val="Compact"/>
+              <w:jc w:val="left"/>
+            </w:pPr>
+            <w:r>
+              <w:t xml:space="preserve">−0.7 [−4.8, +3.5]</w:t>
+            </w:r>
+          </w:p>
+        </w:tc>
+        <w:tc>
+          <w:tcPr/>
+          <w:p>
+            <w:pPr>
+              <w:pStyle w:val="Compact"/>
+              <w:jc w:val="left"/>
+            </w:pPr>
+            <w:r>
+              <w:t xml:space="preserve">+3.4 to +5.3</w:t>
+            </w:r>
+          </w:p>
+        </w:tc>
+      </w:tr>
+      <w:tr>
+        <w:tc>
+          <w:tcPr/>
+          <w:p>
+            <w:pPr>
+              <w:pStyle w:val="Compact"/>
+              <w:jc w:val="left"/>
+            </w:pPr>
+            <w:r>
+              <w:t xml:space="preserve">pc2</w:t>
+            </w:r>
+          </w:p>
+        </w:tc>
+        <w:tc>
+          <w:tcPr/>
+          <w:p>
+            <w:pPr>
+              <w:pStyle w:val="Compact"/>
+              <w:jc w:val="left"/>
+            </w:pPr>
+            <w:r>
+              <w:t xml:space="preserve">5,589</w:t>
+            </w:r>
+          </w:p>
+        </w:tc>
+        <w:tc>
+          <w:tcPr/>
+          <w:p>
+            <w:pPr>
+              <w:pStyle w:val="Compact"/>
+              <w:jc w:val="left"/>
+            </w:pPr>
+            <w:r>
+              <w:t xml:space="preserve">83%</w:t>
+            </w:r>
+          </w:p>
+        </w:tc>
+        <w:tc>
+          <w:tcPr/>
+          <w:p>
+            <w:pPr>
+              <w:pStyle w:val="Compact"/>
+              <w:jc w:val="left"/>
+            </w:pPr>
+            <w:r>
+              <w:t xml:space="preserve">0.81</w:t>
+            </w:r>
+          </w:p>
+        </w:tc>
+        <w:tc>
+          <w:tcPr/>
+          <w:p>
+            <w:pPr>
+              <w:pStyle w:val="Compact"/>
+              <w:jc w:val="left"/>
+            </w:pPr>
+            <w:r>
+              <w:t xml:space="preserve">−25.5 [−28.2, −22.8]</w:t>
+            </w:r>
+          </w:p>
+        </w:tc>
+        <w:tc>
+          <w:tcPr/>
+          <w:p>
+            <w:pPr>
+              <w:pStyle w:val="Compact"/>
+              <w:jc w:val="left"/>
+            </w:pPr>
+            <w:r>
+              <w:t xml:space="preserve">−27.5 [−31.5, −23.4]</w:t>
+            </w:r>
+          </w:p>
+        </w:tc>
+        <w:tc>
+          <w:tcPr/>
+          <w:p>
+            <w:pPr>
+              <w:pStyle w:val="Compact"/>
+              <w:jc w:val="left"/>
+            </w:pPr>
+            <w:r>
+              <w:t xml:space="preserve">−17.2 [−22.1, −12.3]</w:t>
+            </w:r>
+          </w:p>
+        </w:tc>
+        <w:tc>
+          <w:tcPr/>
+          <w:p>
+            <w:pPr>
+              <w:pStyle w:val="Compact"/>
+              <w:jc w:val="left"/>
+            </w:pPr>
+            <w:r>
+              <w:t xml:space="preserve">+2.1 [+1.1, +3.2]</w:t>
+            </w:r>
+          </w:p>
+        </w:tc>
+        <w:tc>
+          <w:tcPr/>
+          <w:p>
+            <w:pPr>
+              <w:pStyle w:val="Compact"/>
+              <w:jc w:val="left"/>
+            </w:pPr>
+            <w:r>
+              <w:t xml:space="preserve">−3.1 [−5.7, −0.5]</w:t>
+            </w:r>
+          </w:p>
+        </w:tc>
+        <w:tc>
+          <w:tcPr/>
+          <w:p>
+            <w:pPr>
+              <w:pStyle w:val="Compact"/>
+              <w:jc w:val="left"/>
+            </w:pPr>
+            <w:r>
+              <w:t xml:space="preserve">−0.6 to +2.9</w:t>
+            </w:r>
+          </w:p>
+        </w:tc>
+      </w:tr>
+      <w:tr>
+        <w:tc>
+          <w:tcPr/>
+          <w:p>
+            <w:pPr>
+              <w:pStyle w:val="Compact"/>
+              <w:jc w:val="left"/>
+            </w:pPr>
+            <w:r>
+              <w:t xml:space="preserve">mw1</w:t>
+            </w:r>
+          </w:p>
+        </w:tc>
+        <w:tc>
+          <w:tcPr/>
+          <w:p>
+            <w:pPr>
+              <w:pStyle w:val="Compact"/>
+              <w:jc w:val="left"/>
+            </w:pPr>
+            <w:r>
+              <w:t xml:space="preserve">403</w:t>
+            </w:r>
+          </w:p>
+        </w:tc>
+        <w:tc>
+          <w:tcPr/>
+          <w:p>
+            <w:pPr>
+              <w:pStyle w:val="Compact"/>
+              <w:jc w:val="left"/>
+            </w:pPr>
+            <w:r>
+              <w:t xml:space="preserve">10%</w:t>
+            </w:r>
+          </w:p>
+        </w:tc>
+        <w:tc>
+          <w:tcPr/>
+          <w:p>
+            <w:pPr>
+              <w:pStyle w:val="Compact"/>
+              <w:jc w:val="left"/>
+            </w:pPr>
+            <w:r>
+              <w:t xml:space="preserve">0.07</w:t>
+            </w:r>
+          </w:p>
+        </w:tc>
+        <w:tc>
+          <w:tcPr/>
+          <w:p>
+            <w:pPr>
+              <w:pStyle w:val="Compact"/>
+              <w:jc w:val="left"/>
+            </w:pPr>
+            <w:r>
+              <w:t xml:space="preserve">−2.9 [−6.0, +0.2]</w:t>
+            </w:r>
+          </w:p>
+        </w:tc>
+        <w:tc>
+          <w:tcPr/>
+          <w:p>
+            <w:pPr>
+              <w:pStyle w:val="Compact"/>
+              <w:jc w:val="left"/>
+            </w:pPr>
+            <w:r>
+              <w:t xml:space="preserve">−0.4 [−3.1, +2.2]</w:t>
+            </w:r>
+          </w:p>
+        </w:tc>
+        <w:tc>
+          <w:tcPr/>
+          <w:p>
+            <w:pPr>
+              <w:pStyle w:val="Compact"/>
+              <w:jc w:val="left"/>
+            </w:pPr>
+            <w:r>
+              <w:t xml:space="preserve">+0.1 [−2.0, +2.1]</w:t>
+            </w:r>
+          </w:p>
+        </w:tc>
+        <w:tc>
+          <w:tcPr/>
+          <w:p>
+            <w:pPr>
+              <w:pStyle w:val="Compact"/>
+              <w:jc w:val="left"/>
+            </w:pPr>
+            <w:r>
+              <w:t xml:space="preserve">+0.4 [−1.6, +2.3]</w:t>
+            </w:r>
+          </w:p>
+        </w:tc>
+        <w:tc>
+          <w:tcPr/>
+          <w:p>
+            <w:pPr>
+              <w:pStyle w:val="Compact"/>
+              <w:jc w:val="left"/>
+            </w:pPr>
+            <w:r>
+              <w:t xml:space="preserve">−0.6 [−2.7, +1.6]</w:t>
+            </w:r>
+          </w:p>
+        </w:tc>
+        <w:tc>
+          <w:tcPr/>
+          <w:p>
+            <w:pPr>
+              <w:pStyle w:val="Compact"/>
+              <w:jc w:val="left"/>
+            </w:pPr>
+            <w:r>
+              <w:t xml:space="preserve">−2.1 to +1.6</w:t>
+            </w:r>
+          </w:p>
+        </w:tc>
+      </w:tr>
+      <w:tr>
+        <w:tc>
+          <w:tcPr/>
+          <w:p>
+            <w:pPr>
+              <w:pStyle w:val="Compact"/>
+              <w:jc w:val="left"/>
+            </w:pPr>
+            <w:r>
+              <w:t xml:space="preserve">KDDCup99</w:t>
+            </w:r>
+          </w:p>
+        </w:tc>
+        <w:tc>
+          <w:tcPr/>
+          <w:p>
+            <w:pPr>
+              <w:pStyle w:val="Compact"/>
+              <w:jc w:val="left"/>
+            </w:pPr>
+            <w:r>
+              <w:t xml:space="preserve">494,020</w:t>
+            </w:r>
+          </w:p>
+        </w:tc>
+        <w:tc>
+          <w:tcPr/>
+          <w:p>
+            <w:pPr>
+              <w:pStyle w:val="Compact"/>
+              <w:jc w:val="left"/>
+            </w:pPr>
+            <w:r>
+              <w:t xml:space="preserve">63%</w:t>
+            </w:r>
+          </w:p>
+        </w:tc>
+        <w:tc>
+          <w:tcPr/>
+          <w:p>
+            <w:pPr>
+              <w:pStyle w:val="Compact"/>
+              <w:jc w:val="left"/>
+            </w:pPr>
+            <w:r>
+              <w:t xml:space="preserve">0.61</w:t>
+            </w:r>
+          </w:p>
+        </w:tc>
+        <w:tc>
+          <w:tcPr/>
+          <w:p>
+            <w:pPr>
+              <w:pStyle w:val="Compact"/>
+              <w:jc w:val="left"/>
+            </w:pPr>
+            <w:r>
+              <w:t xml:space="preserve">−13.7 [−14.6, −12.7]</w:t>
+            </w:r>
+          </w:p>
+        </w:tc>
+        <w:tc>
+          <w:tcPr/>
+          <w:p>
+            <w:pPr>
+              <w:pStyle w:val="Compact"/>
+              <w:jc w:val="left"/>
+            </w:pPr>
+            <w:r>
+              <w:t xml:space="preserve">−1.4 [−1.9, −0.8]</w:t>
+            </w:r>
+          </w:p>
+        </w:tc>
+        <w:tc>
+          <w:tcPr/>
+          <w:p>
+            <w:pPr>
+              <w:pStyle w:val="Compact"/>
+              <w:jc w:val="left"/>
+            </w:pPr>
+            <w:r>
+              <w:t xml:space="preserve">+5.9 [+2.9, +8.8]</w:t>
+            </w:r>
+          </w:p>
+        </w:tc>
+        <w:tc>
+          <w:tcPr/>
+          <w:p>
+            <w:pPr>
+              <w:pStyle w:val="Compact"/>
+              <w:jc w:val="left"/>
+            </w:pPr>
+            <w:r>
+              <w:t xml:space="preserve">+8.5 [+8.3, +8.7]</w:t>
+            </w:r>
+          </w:p>
+        </w:tc>
+        <w:tc>
+          <w:tcPr/>
+          <w:p>
+            <w:pPr>
+              <w:pStyle w:val="Compact"/>
+              <w:jc w:val="left"/>
+            </w:pPr>
+            <w:r>
+              <w:t xml:space="preserve">−12.4 [−13.7, −11.1]</w:t>
+            </w:r>
+          </w:p>
+        </w:tc>
+        <w:tc>
+          <w:tcPr/>
+          <w:p>
+            <w:pPr>
+              <w:pStyle w:val="Compact"/>
+              <w:jc w:val="left"/>
+            </w:pPr>
+            <w:r>
+              <w:t xml:space="preserve">−0.4 to +8.5</w:t>
+            </w:r>
+          </w:p>
+        </w:tc>
+      </w:tr>
+    </w:tbl>
+    <w:bookmarkEnd w:id="46"/>
+    <w:bookmarkStart w:id="53" w:name="controlled-experiments-1"/>
+    <w:p>
+      <w:pPr>
+        <w:pStyle w:val="Heading2"/>
+      </w:pPr>
+      <w:r>
+        <w:rPr>
+          <w:rStyle w:val="SectionNumber"/>
+        </w:rPr>
+        <w:t xml:space="preserve">5.5</w:t>
       </w:r>
       <w:r>
         <w:tab/>
@@ -11191,7 +12905,7 @@
         <w:t xml:space="preserve"> </w:t>
       </w:r>
       <w:r>
-        <w:t xml:space="preserve">Injecting exact copies into the 20 duplicate-free datasets with at least 1,000 rows raised the exposure as Proposition 2 predicts. At duplication rates</w:t>
+        <w:t xml:space="preserve">Injecting exact copies into the duplicate-free datasets with at least 1,000 rows (20 classification, 16 regression) raised the exposure as Proposition 2 predicts. At duplication rates</w:t>
       </w:r>
       <w:r>
         <w:t xml:space="preserve"> </w:t>
@@ -11407,18 +13121,18 @@
           <wp:inline>
             <wp:extent cx="5334000" cy="2174671"/>
             <wp:effectExtent b="0" l="0" r="0" t="0"/>
-            <wp:docPr descr="Fig. 4 Controlled duplicate injection into duplicate-free datasets: median novel-record coverage gap (coverage − 0.90) versus injected duplication rate, for split CP (solid) and novelty-Mondrian CP (dotted)" title="" id="47" name="Picture"/>
+            <wp:docPr descr="Fig. 4 Controlled duplicate injection into duplicate-free datasets: median novel-record coverage gap (coverage − 0.90) versus injected duplication rate, for split CP (solid) and novelty-Mondrian CP (dotted)" title="" id="48" name="Picture"/>
             <a:graphic>
               <a:graphicData uri="http://schemas.openxmlformats.org/drawingml/2006/picture">
                 <pic:pic>
                   <pic:nvPicPr>
-                    <pic:cNvPr descr="Fig4.png" id="48" name="Picture"/>
+                    <pic:cNvPr descr="Fig4.png" id="49" name="Picture"/>
                     <pic:cNvPicPr>
                       <a:picLocks noChangeArrowheads="1" noChangeAspect="1"/>
                     </pic:cNvPicPr>
                   </pic:nvPicPr>
                   <pic:blipFill>
-                    <a:blip r:embed="rId46"/>
+                    <a:blip r:embed="rId47"/>
                     <a:stretch>
                       <a:fillRect/>
                     </a:stretch>
@@ -11478,7 +13192,7 @@
         <w:t xml:space="preserve"> </w:t>
       </w:r>
       <w:r>
-        <w:t xml:space="preserve">On the 20 benchmark datasets with</w:t>
+        <w:t xml:space="preserve">On the benchmark datasets with</w:t>
       </w:r>
       <w:r>
         <w:t xml:space="preserve"> </w:t>
@@ -11505,7 +13219,10 @@
         </m:r>
       </m:oMath>
       <w:r>
-        <w:t xml:space="preserve">, reducing flexibility lowered the coverage of seen records, as expected. For random forests the median went from 0.967 (leaf size 1) to 0.930 (leaf size 100) in classification, and from 0.972 to 0.921 in regression. The corresponding change in the novel-record gap was too small to detect, however. Median gaps were −0.7 versus −0.7 pp (classification) and −1.3 versus −0.6 pp (regression), and the within-dataset trend tests were not significant (RF:</w:t>
+        <w:t xml:space="preserve"> </w:t>
+      </w:r>
+      <w:r>
+        <w:t xml:space="preserve">(20 classification, 9 regression), reducing flexibility lowered the coverage of seen records, as expected. For random forests the median went from 0.967 (leaf size 1) to 0.930 (leaf size 100) in classification, and from 0.972 to 0.921 in regression. The corresponding change in the novel-record gap was too small to detect, however. Median gaps were −0.7 versus −0.7 pp (classification) and −1.3 versus −0.6 pp (regression), and the within-dataset trend tests were not significant (RF:</w:t>
       </w:r>
       <w:r>
         <w:t xml:space="preserve"> </w:t>
@@ -11595,18 +13312,18 @@
           <wp:inline>
             <wp:extent cx="5334000" cy="2156575"/>
             <wp:effectExtent b="0" l="0" r="0" t="0"/>
-            <wp:docPr descr="Fig. 5 Capacity experiment on benchmark datasets with predicted exposure ≥ 0.05: median novel-record coverage gap versus capacity level (0 = most flexible), for split CP (solid) and novelty-Mondrian CP (dotted)" title="" id="50" name="Picture"/>
+            <wp:docPr descr="Fig. 5 Capacity experiment on benchmark datasets with predicted exposure ≥ 0.05: median novel-record coverage gap versus capacity level (0 = most flexible), for split CP (solid) and novelty-Mondrian CP (dotted)" title="" id="51" name="Picture"/>
             <a:graphic>
               <a:graphicData uri="http://schemas.openxmlformats.org/drawingml/2006/picture">
                 <pic:pic>
                   <pic:nvPicPr>
-                    <pic:cNvPr descr="Fig5.png" id="51" name="Picture"/>
+                    <pic:cNvPr descr="Fig5.png" id="52" name="Picture"/>
                     <pic:cNvPicPr>
                       <a:picLocks noChangeArrowheads="1" noChangeAspect="1"/>
                     </pic:cNvPicPr>
                   </pic:nvPicPr>
                   <pic:blipFill>
-                    <a:blip r:embed="rId49"/>
+                    <a:blip r:embed="rId50"/>
                     <a:stretch>
                       <a:fillRect/>
                     </a:stretch>
@@ -11651,8 +13368,8 @@
         <w:t xml:space="preserve">Capacity experiment on benchmark datasets with predicted exposure ≥ 0.05: median novel-record coverage gap versus capacity level (0 = most flexible), for split CP (solid) and novelty-Mondrian CP (dotted)</w:t>
       </w:r>
     </w:p>
-    <w:bookmarkEnd w:id="52"/>
-    <w:bookmarkStart w:id="53" w:name="remedies"/>
+    <w:bookmarkEnd w:id="53"/>
+    <w:bookmarkStart w:id="54" w:name="remedies"/>
     <w:p>
       <w:pPr>
         <w:pStyle w:val="Heading2"/>
@@ -11661,7 +13378,7 @@
         <w:rPr>
           <w:rStyle w:val="SectionNumber"/>
         </w:rPr>
-        <w:t xml:space="preserve">5.5</w:t>
+        <w:t xml:space="preserve">5.6</w:t>
       </w:r>
       <w:r>
         <w:tab/>
@@ -11685,7 +13402,36 @@
         <w:t xml:space="preserve"> </w:t>
       </w:r>
       <w:r>
-        <w:t xml:space="preserve">MCP-R restores nominal coverage on novel records. Its median gap lies between −0.1 to +3.6 pp across families, and the bootstrap confidence interval of the median lies above the −1 pp non-inferiority margin in all families (smallest lower bound −0.5 pp). It improves on SCP-R significantly after Holm correction in 6 of 16 families (Table 2). Its worst dataset-level gap is −5.8 pp, against −16.9 pp for SCP-R. That worst case (solar_flare) reflects sampling noise from only about 36 novel calibration rows per split: in a verification run with 200 further splits, MCP-R novel coverage was 0.909 (95% CI 0.899–0.918) for LightGBM and 0.907 (0.896–0.917) for ridge, while SCP-R reached 0.78 and 0.77. The trivial-set fallback was never triggered (0 dataset-level occurrences). The price is small. Median sets or intervals for novel records grow by a factor of 0.995–1.044, and the overall average changes by a factor of 0.987–1.009, because seen records receive tighter sets.</w:t>
+        <w:t xml:space="preserve">MCP-R restores nominal coverage on novel records. Its median gap ranges from −0.1 to +0.3 pp across families (+3.6 pp for the tie-inflated</w:t>
+      </w:r>
+      <w:r>
+        <w:t xml:space="preserve"> </w:t>
+      </w:r>
+      <m:oMath>
+        <m:r>
+          <m:t>k</m:t>
+        </m:r>
+      </m:oMath>
+      <w:r>
+        <w:t xml:space="preserve">-NN/LAC combination), and the bootstrap confidence interval of the median lies above the −1 pp non-inferiority margin in all families (smallest lower bound −0.5 pp). It improves on SCP-R significantly after Holm correction in 6 of 16 families (Table 2). Its worst dataset-level gap is −5.8 pp, against −16.9 pp for SCP-R. That worst case (solar_flare) reflects sampling noise from only about 36 novel calibration rows per split: in a verification run with 200 further splits, MCP-R novel coverage was 0.909 (95% CI 0.899–0.918) for LightGBM and 0.907 (0.896–0.917) for ridge, while SCP-R reached 0.78 and 0.77. The trivial-set fallback was never triggered (0 dataset-level occurrences). The price is small. Median sets or intervals for novel records grow by a factor of 0.995–1.044, and the overall average changes by a factor of 0.987–1.009, because seen records receive tighter sets.</w:t>
+      </w:r>
+    </w:p>
+    <w:p>
+      <w:pPr>
+        <w:pStyle w:val="BodyText"/>
+      </w:pPr>
+      <w:r>
+        <w:rPr>
+          <w:bCs/>
+          <w:b/>
+        </w:rPr>
+        <w:t xml:space="preserve">Computational cost.</w:t>
+      </w:r>
+      <w:r>
+        <w:t xml:space="preserve"> </w:t>
+      </w:r>
+      <w:r>
+        <w:t xml:space="preserve">On 30,000-row datasets, hashing the records took at most 0.16 s, the audit at most 8 ms and the seen/novel taxonomy at most 7 ms. Computing the conformal thresholds took a median of 14 µs for split CP and 44 µs for novelty-Mondrian CP. Fitting and predicting with a single LightGBM model took 0.6–2.8 s (Online Resource 1). The remedy is therefore free in practice.</w:t>
       </w:r>
     </w:p>
     <w:p>
@@ -11784,7 +13530,7 @@
         <w:t xml:space="preserve"> </w:t>
       </w:r>
       <w:r>
-        <w:t xml:space="preserve">the median SCP-R gaps range from −0.4 to +2.0 pp (worst −10.6 pp; 1 families significant). At</w:t>
+        <w:t xml:space="preserve">the median SCP-R gaps range from −0.4 to +2.0 pp (worst −10.6 pp; families significant after Holm correction: 1). At</w:t>
       </w:r>
       <w:r>
         <w:t xml:space="preserve"> </w:t>
@@ -11807,11 +13553,11 @@
         <w:t xml:space="preserve"> </w:t>
       </w:r>
       <w:r>
-        <w:t xml:space="preserve">they range from −1.6 to +3.9 pp (worst −25.8 pp; 1 significant). The smallest lower confidence bound of the MCP-R median gap is −0.4 pp and −0.5 pp, respectively.</w:t>
-      </w:r>
-    </w:p>
-    <w:bookmarkEnd w:id="53"/>
-    <w:bookmarkStart w:id="57" w:name="X4510442245e4a3db816f2efdc88f6b165d18e36"/>
+        <w:t xml:space="preserve">they range from −1.6 to +3.9 pp (worst −25.8 pp; significant: 1). The smallest lower confidence bound of the MCP-R median gap is −0.4 pp and −0.5 pp, respectively.</w:t>
+      </w:r>
+    </w:p>
+    <w:bookmarkEnd w:id="54"/>
+    <w:bookmarkStart w:id="58" w:name="X4510442245e4a3db816f2efdc88f6b165d18e36"/>
     <w:p>
       <w:pPr>
         <w:pStyle w:val="Heading2"/>
@@ -11820,7 +13566,7 @@
         <w:rPr>
           <w:rStyle w:val="SectionNumber"/>
         </w:rPr>
-        <w:t xml:space="preserve">5.6</w:t>
+        <w:t xml:space="preserve">5.7</w:t>
       </w:r>
       <w:r>
         <w:tab/>
@@ -12678,18 +14424,18 @@
           <wp:inline>
             <wp:extent cx="5334000" cy="1757113"/>
             <wp:effectExtent b="0" l="0" r="0" t="0"/>
-            <wp:docPr descr="Fig. 6 Overconfidence (mean top-label confidence − accuracy) on seen, all and novel test rows for each duplicated classification dataset (dots) and learner; black bars: medians" title="" id="55" name="Picture"/>
+            <wp:docPr descr="Fig. 6 Overconfidence (mean top-label confidence − accuracy) on seen, all and novel test rows for each duplicated classification dataset (dots) and learner; black bars: medians" title="" id="56" name="Picture"/>
             <a:graphic>
               <a:graphicData uri="http://schemas.openxmlformats.org/drawingml/2006/picture">
                 <pic:pic>
                   <pic:nvPicPr>
-                    <pic:cNvPr descr="Fig6.png" id="56" name="Picture"/>
+                    <pic:cNvPr descr="Fig6.png" id="57" name="Picture"/>
                     <pic:cNvPicPr>
                       <a:picLocks noChangeArrowheads="1" noChangeAspect="1"/>
                     </pic:cNvPicPr>
                   </pic:nvPicPr>
                   <pic:blipFill>
-                    <a:blip r:embed="rId54"/>
+                    <a:blip r:embed="rId55"/>
                     <a:stretch>
                       <a:fillRect/>
                     </a:stretch>
@@ -12734,8 +14480,8 @@
         <w:t xml:space="preserve">Overconfidence (mean top-label confidence − accuracy) on seen, all and novel test rows for each duplicated classification dataset (dots) and learner; black bars: medians</w:t>
       </w:r>
     </w:p>
-    <w:bookmarkEnd w:id="57"/>
-    <w:bookmarkStart w:id="61" w:name="near-duplicates-exploratory"/>
+    <w:bookmarkEnd w:id="58"/>
+    <w:bookmarkStart w:id="62" w:name="near-duplicates-exploratory"/>
     <w:p>
       <w:pPr>
         <w:pStyle w:val="Heading2"/>
@@ -12744,7 +14490,7 @@
         <w:rPr>
           <w:rStyle w:val="SectionNumber"/>
         </w:rPr>
-        <w:t xml:space="preserve">5.7</w:t>
+        <w:t xml:space="preserve">5.8</w:t>
       </w:r>
       <w:r>
         <w:tab/>
@@ -12770,18 +14516,18 @@
           <wp:inline>
             <wp:extent cx="5334000" cy="1986202"/>
             <wp:effectExtent b="0" l="0" r="0" t="0"/>
-            <wp:docPr descr="Fig. 7 Exploratory. Median coverage of split CP by distance of the test record to its nearest training record (quintile bins with training-only edges; “Seen” = exact training copy), and of the six-bin distance-Mondrian variant (dotted), \alpha=0.1" title="" id="59" name="Picture"/>
+            <wp:docPr descr="Fig. 7 Exploratory. Median coverage of split CP by distance of the test record to its nearest training record (quintile bins with training-only edges; “Seen” = exact training copy), and of the six-bin distance-Mondrian variant (dotted), \alpha=0.1" title="" id="60" name="Picture"/>
             <a:graphic>
               <a:graphicData uri="http://schemas.openxmlformats.org/drawingml/2006/picture">
                 <pic:pic>
                   <pic:nvPicPr>
-                    <pic:cNvPr descr="Fig7.png" id="60" name="Picture"/>
+                    <pic:cNvPr descr="Fig7.png" id="61" name="Picture"/>
                     <pic:cNvPicPr>
                       <a:picLocks noChangeArrowheads="1" noChangeAspect="1"/>
                     </pic:cNvPicPr>
                   </pic:nvPicPr>
                   <pic:blipFill>
-                    <a:blip r:embed="rId58"/>
+                    <a:blip r:embed="rId59"/>
                     <a:stretch>
                       <a:fillRect/>
                     </a:stretch>
@@ -12861,9 +14607,9 @@
         </m:r>
       </m:oMath>
     </w:p>
-    <w:bookmarkEnd w:id="61"/>
     <w:bookmarkEnd w:id="62"/>
-    <w:bookmarkStart w:id="67" w:name="discussion"/>
+    <w:bookmarkEnd w:id="63"/>
+    <w:bookmarkStart w:id="68" w:name="discussion"/>
     <w:p>
       <w:pPr>
         <w:pStyle w:val="Heading1"/>
@@ -12881,7 +14627,7 @@
         <w:t xml:space="preserve">Discussion</w:t>
       </w:r>
     </w:p>
-    <w:bookmarkStart w:id="63" w:name="what-the-evidence-establishes"/>
+    <w:bookmarkStart w:id="64" w:name="what-the-evidence-establishes"/>
     <w:p>
       <w:pPr>
         <w:pStyle w:val="Heading2"/>
@@ -12951,7 +14697,7 @@
         <w:pStyle w:val="BodyText"/>
       </w:pPr>
       <w:r>
-        <w:t xml:space="preserve">The pre-registered primary hypothesis was nonetheless not supported. Across the duplicated datasets of two standard suites, the</w:t>
+        <w:t xml:space="preserve">The pre-specified primary hypothesis was nonetheless not supported. Across the duplicated datasets of two standard suites, the</w:t>
       </w:r>
       <w:r>
         <w:t xml:space="preserve"> </w:t>
@@ -12967,11 +14713,19 @@
         <w:t xml:space="preserve"> </w:t>
       </w:r>
       <w:r>
-        <w:t xml:space="preserve">gap is a fraction of a percentage point. For most benchmark datasets used in CP research, duplicate leakage therefore does not materially distort reported coverage, and this negative result is itself useful. The practical risk lies in the tail: datasets with high exposure and consistent duplicate labels, such as the NASA defect data, whose duplication problems are documented in the software-engineering literature (Gray et al. 2011; Shepperd et al. 2013), where novel-record coverage can be 5–17 points below what is reported.</w:t>
-      </w:r>
-    </w:p>
-    <w:bookmarkEnd w:id="63"/>
-    <w:bookmarkStart w:id="64" w:name="recommendations"/>
+        <w:t xml:space="preserve">gap is a fraction of a percentage point. For most benchmark datasets used in CP research, duplicate leakage therefore does not materially distort reported coverage, and this negative result is itself useful. The practical risk lies in the tail: datasets with high exposure and consistent duplicate labels. There, novel-record coverage was up to −16.9 points below what is reported in the benchmark suites (solar_flare). In the external NASA defect and KDD Cup’99 data, whose duplication problems are documented (Gray et al. 2011; Shepperd et al. 2013; Tavallaee et al. 2009), it was up to −27.5 points below.</w:t>
+      </w:r>
+    </w:p>
+    <w:p>
+      <w:pPr>
+        <w:pStyle w:val="BodyText"/>
+      </w:pPr>
+      <w:r>
+        <w:t xml:space="preserve">In natural data, seen and novel records also differ in typicality: frequently repeated profiles are common configurations, whereas novel records are often rare ones. Part of the observed gap may therefore reflect that novel records are intrinsically harder, not only that the model memorized its training rows. The injection experiment separates the two. There, duplicated rows were chosen uniformly at random, so seen and novel records come from the same distribution, and the gap still grew with exposure for flexible learners.</w:t>
+      </w:r>
+    </w:p>
+    <w:bookmarkEnd w:id="64"/>
+    <w:bookmarkStart w:id="65" w:name="recommendations"/>
     <w:p>
       <w:pPr>
         <w:pStyle w:val="Heading2"/>
@@ -13085,8 +14839,8 @@
         <w:t xml:space="preserve">If deployment involves new entities, use novelty-Mondrian calibration, which keeps the standard split and is valid for any mix of seen and new records, or a group-aware split, which evaluates new records only. If identical profiles legitimately recur at deployment, the row-level guarantee may be the right target, but the seen/novel breakdown should still be reported.</w:t>
       </w:r>
     </w:p>
-    <w:bookmarkEnd w:id="64"/>
-    <w:bookmarkStart w:id="65" w:name="relation-to-prior-work"/>
+    <w:bookmarkEnd w:id="65"/>
+    <w:bookmarkStart w:id="66" w:name="relation-to-prior-work"/>
     <w:p>
       <w:pPr>
         <w:pStyle w:val="Heading2"/>
@@ -13112,8 +14866,8 @@
         <w:t xml:space="preserve">Our findings complement the duplicate audits of Li (2026) and Roth (2026). They show inflated accuracy and distorted rankings; we show that the formal coverage guarantee of CP is affected in a predictable, quantifiable way, and that a remedy with a guarantee exists. Group-conditional CP has been used for protected groups (Romano et al. 2020b), classes (Löfström et al. 2015; Ding et al. 2023) and difficulty strata (Boström and Johansson 2020). The grouping studied here differs in two ways: it is induced by the split itself, and it is defined by membership of the training set. Lemma 0 shows that conditioning on the training set makes such a data-dependent taxonomy admissible. The near-duplicate analysis indicates that exact duplication is the extreme case of a broader dependence of coverage on distance to the training data, consistent with work on localized and difficulty-adaptive CP (Papadopoulos et al. 2011; Guan 2023).</w:t>
       </w:r>
     </w:p>
-    <w:bookmarkEnd w:id="65"/>
-    <w:bookmarkStart w:id="66" w:name="limitations"/>
+    <w:bookmarkEnd w:id="66"/>
+    <w:bookmarkStart w:id="67" w:name="limitations"/>
     <w:p>
       <w:pPr>
         <w:pStyle w:val="Heading2"/>
@@ -13293,12 +15047,34 @@
         <w:t xml:space="preserve"> </w:t>
       </w:r>
       <w:r>
-        <w:t xml:space="preserve">The exposure-stratified and decomposition analyses were added after the primary result and are exploratory.</w:t>
-      </w:r>
-    </w:p>
-    <w:bookmarkEnd w:id="66"/>
+        <w:t xml:space="preserve">The exposure-stratified and decomposition analyses were added after the primary result and are exploratory. The external validation set was specified after the first internal review round, but before its outcomes were computed.</w:t>
+      </w:r>
+    </w:p>
+    <w:p>
+      <w:pPr>
+        <w:numPr>
+          <w:ilvl w:val="0"/>
+          <w:numId w:val="1004"/>
+        </w:numPr>
+        <w:pStyle w:val="Compact"/>
+      </w:pPr>
+      <w:r>
+        <w:rPr>
+          <w:bCs/>
+          <w:b/>
+        </w:rPr>
+        <w:t xml:space="preserve">Protocol registration.</w:t>
+      </w:r>
+      <w:r>
+        <w:t xml:space="preserve"> </w:t>
+      </w:r>
+      <w:r>
+        <w:t xml:space="preserve">The protocol was fixed by a version-control commit, not by an external registry, so readers must rely on the repository history to verify its timing.</w:t>
+      </w:r>
+    </w:p>
     <w:bookmarkEnd w:id="67"/>
-    <w:bookmarkStart w:id="68" w:name="conclusion"/>
+    <w:bookmarkEnd w:id="68"/>
+    <w:bookmarkStart w:id="69" w:name="conclusion"/>
     <w:p>
       <w:pPr>
         <w:pStyle w:val="Heading1"/>
@@ -13324,8 +15100,8 @@
         <w:t xml:space="preserve">Duplicate records do not invalidate the marginal guarantee of conformal prediction, but they can redistribute its errors onto new records. The size of that shift is given exactly by the exposure and the over-coverage of seen records. In standard tabular benchmarks the shift is negligible for most datasets but substantial for a predictable minority. A label-free audit identifies the minority, and novelty-Mondrian calibration repairs coverage on new records with a finite-sample guarantee at small cost. We recommend that conformal evaluations on tabular data report duplicate exposure and coverage on novel records alongside the usual marginal coverage.</w:t>
       </w:r>
     </w:p>
-    <w:bookmarkEnd w:id="68"/>
-    <w:bookmarkStart w:id="69" w:name="statements-and-declarations"/>
+    <w:bookmarkEnd w:id="69"/>
+    <w:bookmarkStart w:id="70" w:name="statements-and-declarations"/>
     <w:p>
       <w:pPr>
         <w:pStyle w:val="Heading1"/>
@@ -13460,8 +15236,8 @@
         <w:t xml:space="preserve">The study design, literature search, code, experiments, statistical analysis and drafting of this manuscript were carried out with substantial assistance from an AI system (a large language model operating as an agent with code-execution tools), under the direction of the human author(s). All numerical results were produced by executed code whose outputs are archived with the repository. The human author(s) reviewed the work and take full responsibility for its content. [AUTHOR TO CONFIRM wording against the journal’s current AI policy.]</w:t>
       </w:r>
     </w:p>
-    <w:bookmarkEnd w:id="69"/>
-    <w:bookmarkStart w:id="70" w:name="references"/>
+    <w:bookmarkEnd w:id="70"/>
+    <w:bookmarkStart w:id="71" w:name="references"/>
     <w:p>
       <w:pPr>
         <w:pStyle w:val="Heading1"/>
@@ -13507,6 +15283,14 @@
         <w:pStyle w:val="BodyText"/>
       </w:pPr>
       <w:r>
+        <w:t xml:space="preserve">Bastani O, Gupta V, Jung C, Noarov G, Ramalingam R, Roth A (2022) Practical adversarial multivalid conformal prediction. In: Advances in Neural Information Processing Systems 35, pp 29362–29373. https://doi.org/10.52202/068431-2129</w:t>
+      </w:r>
+    </w:p>
+    <w:p>
+      <w:pPr>
+        <w:pStyle w:val="BodyText"/>
+      </w:pPr>
+      <w:r>
         <w:t xml:space="preserve">Bischl B, Casalicchio G, Feurer M, Gijsbers P, Hutter F, Lang M, Mantovani RG, van Rijn JN, Vanschoren J (2021) OpenML benchmarking suites. In: Proceedings of the Neural Information Processing Systems Track on Datasets and Benchmarks 1. arXiv:1708.03731</w:t>
       </w:r>
     </w:p>
@@ -13830,7 +15614,7 @@
         <w:t xml:space="preserve">Wilcoxon F (1945) Individual comparisons by ranking methods. Biometrics Bull 1(6):80–83. https://doi.org/10.2307/3001968</w:t>
       </w:r>
     </w:p>
-    <w:bookmarkEnd w:id="70"/>
+    <w:bookmarkEnd w:id="71"/>
     <w:sectPr/>
   </w:body>
 </w:document>

</xml_diff>

<commit_message>
Final revision: complete injection results, external validation, consistency and reproducibility audits, submission package, readiness decision
Co-Authored-By: Claude Opus 5.5 <noreply@anthropic.com>
Claude-Session: https://claude.ai/code/session_011swGQJjskr3eenk5bukhrn
</commit_message>
<xml_diff>
--- a/manuscript/Final_Manuscript.docx
+++ b/manuscript/Final_Manuscript.docx
@@ -12905,7 +12905,7 @@
         <w:t xml:space="preserve"> </w:t>
       </w:r>
       <w:r>
-        <w:t xml:space="preserve">Injecting exact copies into the duplicate-free datasets with at least 1,000 rows (20 classification, 16 regression) raised the exposure as Proposition 2 predicts. At duplication rates</w:t>
+        <w:t xml:space="preserve">Injecting exact copies into the duplicate-free datasets with at least 1,000 rows (21 classification, 16 regression) raised the exposure as Proposition 2 predicts. At duplication rates</w:t>
       </w:r>
       <w:r>
         <w:t xml:space="preserve"> </w:t>
@@ -12942,7 +12942,7 @@
         <w:t xml:space="preserve"> </w:t>
       </w:r>
       <w:r>
-        <w:t xml:space="preserve">to −6.3 pp at</w:t>
+        <w:t xml:space="preserve">to −6.1 pp at</w:t>
       </w:r>
       <w:r>
         <w:t xml:space="preserve"> </w:t>
@@ -12965,7 +12965,7 @@
         <w:t xml:space="preserve"> </w:t>
       </w:r>
       <w:r>
-        <w:t xml:space="preserve">and −12.4 pp at</w:t>
+        <w:t xml:space="preserve">and −12.8 pp at</w:t>
       </w:r>
       <w:r>
         <w:t xml:space="preserve"> </w:t>
@@ -12988,7 +12988,7 @@
         <w:t xml:space="preserve"> </w:t>
       </w:r>
       <w:r>
-        <w:t xml:space="preserve">in classification (−11.8 pp in regression), against a memorization limit of −14.8 pp. For LightGBM it reached −7.6 pp (classification) and −5.3 pp (regression). Regularized linear models were barely affected (−0.8 and −0.1 pp), because their seen records are not over-covered. The within-dataset Spearman correlation between</w:t>
+        <w:t xml:space="preserve">in classification (−11.8 pp in regression), against a memorization limit of −14.8 pp. For LightGBM it reached −7.9 pp (classification) and −5.3 pp (regression). Regularized linear models were barely affected (−0.8 and −0.1 pp), because their seen records are not over-covered. The within-dataset Spearman correlation between</w:t>
       </w:r>
       <w:r>
         <w:t xml:space="preserve"> </w:t>
@@ -13078,7 +13078,7 @@
         </m:r>
       </m:oMath>
       <w:r>
-        <w:t xml:space="preserve">: +0.4 and +0.5 pp). For</w:t>
+        <w:t xml:space="preserve">: +0.3 and +0.5 pp). For</w:t>
       </w:r>
       <w:r>
         <w:t xml:space="preserve"> </w:t>
@@ -13089,7 +13089,7 @@
         </m:r>
       </m:oMath>
       <w:r>
-        <w:t xml:space="preserve">-NN classification, tied scores make split CP conservative at baseline (+4.8 pp), and injection erodes this margin (+1.3 pp at</w:t>
+        <w:t xml:space="preserve">-NN classification, tied scores make split CP conservative at baseline (+4.7 pp), and injection erodes this margin (+1.5 pp at</w:t>
       </w:r>
       <w:r>
         <w:t xml:space="preserve"> </w:t>

</xml_diff>

<commit_message>
Retarget to Pattern Recognition: numbered references, highlights, Elsevier declarations, normalized-score baseline (review round 11), updated audits
Co-Authored-By: Claude Opus 5.5 <noreply@anthropic.com>
Claude-Session: https://claude.ai/code/session_011swGQJjskr3eenk5bukhrn
</commit_message>
<xml_diff>
--- a/manuscript/Final_Manuscript.docx
+++ b/manuscript/Final_Manuscript.docx
@@ -121,7 +121,7 @@
         <w:t xml:space="preserve"> </w:t>
       </w:r>
       <w:r>
-        <w:t xml:space="preserve">Split conformal prediction guarantees that prediction sets cover the true label with a chosen probability, but only on average over held-out rows. When a tabular dataset contains repeated records, a random split places exact copies of some test rows in the training set, and the guarantee then averages over rows the model has already seen and genuinely new ones. We show that coverage on new (novel) records equals</w:t>
+        <w:t xml:space="preserve">Split conformal prediction guarantees that its prediction sets reach a chosen coverage level, but only on average over held-out rows. When a tabular dataset contains repeated records, a random split places exact copies of some test rows in the training set, and the guarantee then averages over rows the model has already seen and genuinely new ones. We show that coverage on new (novel) records equals</w:t>
       </w:r>
       <w:r>
         <w:t xml:space="preserve"> </w:t>
@@ -301,7 +301,7 @@
         <w:t xml:space="preserve"> </w:t>
       </w:r>
       <w:r>
-        <w:t xml:space="preserve">from duplicate-group sizes, and we prove that a novelty-Mondrian conformal predictor is valid for any mix of seen and new records. Across 103 OpenML-CC18 and OpenML-CTR23 datasets, five learners and four scores, the predicted exposure matched the observed exposure (mean absolute error 0.0012). The pre-specified primary hypothesis that the typical duplicated dataset under-covers new records was not supported: median gaps were −0.8 to +0.5 percentage points, excluding a tie-inflated k-NN variant. Shortfalls were concentrated where exposure was high and seen records were over-covered, reaching −16.9 points, and they were reproduced in external defect-prediction and intrusion-detection data and, as a dose–response, by controlled duplicate injection. Novelty-Mondrian calibration restored nominal coverage on new records at a median set-size cost of at most 4.4%.</w:t>
+        <w:t xml:space="preserve">from duplicate-group sizes, and we prove that a novelty-Mondrian conformal predictor is valid for any mix of seen and new records. Across 103 OpenML-CC18/CTR23 datasets, five learners and four scores, predicted and observed exposure agreed closely (mean absolute error 0.0012). The pre-specified primary hypothesis that the typical duplicated dataset under-covers new records was not supported: median gaps were −0.8 to +0.5 percentage points, excluding a tie-inflated k-NN variant. Shortfalls were concentrated where exposure was high and seen records were over-covered, reaching −16.9 points, and they were reproduced in external defect-prediction and intrusion-detection data and, as a dose–response, by controlled duplicate injection. Novelty-Mondrian calibration restored nominal coverage on new records at a median set-size cost of at most 4.4%; in regression, a distance-normalized score also removed most of the shortfall, but without a guarantee.</w:t>
       </w:r>
     </w:p>
     <w:p>
@@ -769,7 +769,7 @@
         <w:t xml:space="preserve">marginal</w:t>
       </w:r>
       <w:r>
-        <w:t xml:space="preserve">: it averages over the joint distribution of covariates and labels. Exact coverage conditional on an arbitrary covariate value cannot be achieved without further assumptions (Vovk 2012; Foygel Barber et al. 2021). Coverage conditional on membership of finitely many pre-specified categories can be achieved, by Mondrian (category-conditional) CP (Vovk et al. 2022) or, more generally, by calibration over a function class (Gibbs et al. 2025) or multivalid calibration over overlapping groups (Bastani et al. 2022). For disjoint groups, conditional calibration reduces to Mondrian calibration. Group-conditional calibration has been used to equalize coverage across protected groups (Romano et al. 2020b), classes (Löfström et al. 2015; Ding et al. 2023) and difficulty strata (Papadopoulos et al. 2011; Boström and Johansson 2020); localized CP reweights calibration scores around a test point (Guan 2023). Robustness of CP to departures from exchangeability is analysed by Tibshirani et al. (2019) and Barber et al. (2023). For data with a known grouping, e.g. repeated measurements of subjects, Dunn et al. (2023) construct prediction sets for new groups. None of these works considers the grouping that arises</w:t>
+        <w:t xml:space="preserve">: it averages over the joint distribution of covariates and labels. Exact coverage conditional on an arbitrary covariate value cannot be achieved without further assumptions (Vovk 2012; Foygel Barber et al. 2021). Coverage conditional on membership of finitely many pre-specified categories can be achieved, by Mondrian (category-conditional) CP (Vovk et al. 2022) or, more generally, by calibration over a function class (Gibbs et al. 2025) or multivalid calibration over overlapping groups (Bastani et al. 2022). For disjoint groups, conditional calibration reduces to Mondrian calibration. Group-conditional calibration has been used to equalize coverage across protected groups (Romano et al. 2020b), classes (Löfström et al. 2015; Ding et al. 2023) and difficulty strata (Papadopoulos et al. 2011; Boström and Johansson 2020); localized CP reweights calibration scores around a test point (Guan 2023). Mondrian-type calibration has recently been applied to spatial modelling (Seo et al. 2026) and to heteroscedastic regression with tree-based conformal predictive systems (Zhang and Zhou 2026), and conformal prediction has been examined under strong distribution shifts in drug-response modelling (Hernandez-Hernandez et al. 2026). Robustness of CP to departures from exchangeability is analysed by Tibshirani et al. (2019) and Barber et al. (2023). For data with a known grouping, e.g. repeated measurements of subjects, Dunn et al. (2023) construct prediction sets for new groups. None of these works considers the grouping that arises</w:t>
       </w:r>
       <w:r>
         <w:t xml:space="preserve"> </w:t>
@@ -13425,6 +13425,195 @@
           <w:bCs/>
           <w:b/>
         </w:rPr>
+        <w:t xml:space="preserve">Locally adaptive scores (additional baseline).</w:t>
+      </w:r>
+      <w:r>
+        <w:t xml:space="preserve"> </w:t>
+      </w:r>
+      <w:r>
+        <w:t xml:space="preserve">A natural question is whether a locally adaptive nonconformity score already absorbs the effect. Seen records lie at distance zero from their training copies, so a distance-normalized score gives them tighter intervals automatically. We therefore added, before computing its outcomes, the normalized residual</w:t>
+      </w:r>
+      <w:r>
+        <w:t xml:space="preserve"> </w:t>
+      </w:r>
+      <m:oMath>
+        <m:d>
+          <m:dPr>
+            <m:begChr m:val="|"/>
+            <m:endChr m:val="|"/>
+            <m:sepChr m:val=""/>
+            <m:grow/>
+          </m:dPr>
+          <m:e>
+            <m:r>
+              <m:t>y</m:t>
+            </m:r>
+            <m:r>
+              <m:rPr>
+                <m:sty m:val="p"/>
+              </m:rPr>
+              <m:t>−</m:t>
+            </m:r>
+            <m:acc>
+              <m:accPr>
+                <m:chr m:val="̂"/>
+              </m:accPr>
+              <m:e>
+                <m:r>
+                  <m:t>y</m:t>
+                </m:r>
+              </m:e>
+            </m:acc>
+          </m:e>
+        </m:d>
+        <m:r>
+          <m:rPr>
+            <m:sty m:val="p"/>
+          </m:rPr>
+          <m:t>/</m:t>
+        </m:r>
+        <m:d>
+          <m:dPr>
+            <m:begChr m:val="("/>
+            <m:endChr m:val=")"/>
+            <m:sepChr m:val=""/>
+            <m:grow/>
+          </m:dPr>
+          <m:e>
+            <m:acc>
+              <m:accPr>
+                <m:chr m:val="̂"/>
+              </m:accPr>
+              <m:e>
+                <m:r>
+                  <m:t>σ</m:t>
+                </m:r>
+              </m:e>
+            </m:acc>
+            <m:d>
+              <m:dPr>
+                <m:begChr m:val="("/>
+                <m:endChr m:val=")"/>
+                <m:sepChr m:val=""/>
+                <m:grow/>
+              </m:dPr>
+              <m:e>
+                <m:r>
+                  <m:t>x</m:t>
+                </m:r>
+              </m:e>
+            </m:d>
+            <m:r>
+              <m:rPr>
+                <m:sty m:val="p"/>
+              </m:rPr>
+              <m:t>+</m:t>
+            </m:r>
+            <m:r>
+              <m:t>β</m:t>
+            </m:r>
+          </m:e>
+        </m:d>
+      </m:oMath>
+      <w:r>
+        <w:t xml:space="preserve"> </w:t>
+      </w:r>
+      <w:r>
+        <w:t xml:space="preserve">of Papadopoulos et al. (2011) on the 12 duplicated regression datasets. Here</w:t>
+      </w:r>
+      <w:r>
+        <w:t xml:space="preserve"> </w:t>
+      </w:r>
+      <m:oMath>
+        <m:acc>
+          <m:accPr>
+            <m:chr m:val="̂"/>
+          </m:accPr>
+          <m:e>
+            <m:r>
+              <m:t>σ</m:t>
+            </m:r>
+          </m:e>
+        </m:acc>
+        <m:d>
+          <m:dPr>
+            <m:begChr m:val="("/>
+            <m:endChr m:val=")"/>
+            <m:sepChr m:val=""/>
+            <m:grow/>
+          </m:dPr>
+          <m:e>
+            <m:r>
+              <m:t>x</m:t>
+            </m:r>
+          </m:e>
+        </m:d>
+      </m:oMath>
+      <w:r>
+        <w:t xml:space="preserve"> </w:t>
+      </w:r>
+      <w:r>
+        <w:t xml:space="preserve">is the mean distance to the 10 nearest training rows and</w:t>
+      </w:r>
+      <w:r>
+        <w:t xml:space="preserve"> </w:t>
+      </w:r>
+      <m:oMath>
+        <m:r>
+          <m:t>β</m:t>
+        </m:r>
+      </m:oMath>
+      <w:r>
+        <w:t xml:space="preserve"> </w:t>
+      </w:r>
+      <w:r>
+        <w:t xml:space="preserve">the median of</w:t>
+      </w:r>
+      <w:r>
+        <w:t xml:space="preserve"> </w:t>
+      </w:r>
+      <m:oMath>
+        <m:acc>
+          <m:accPr>
+            <m:chr m:val="̂"/>
+          </m:accPr>
+          <m:e>
+            <m:r>
+              <m:t>σ</m:t>
+            </m:r>
+          </m:e>
+        </m:acc>
+      </m:oMath>
+      <w:r>
+        <w:t xml:space="preserve"> </w:t>
+      </w:r>
+      <w:r>
+        <w:t xml:space="preserve">over calibration rows. With this score, split CP was close to nominal on novel records. Median gaps were +0.1 pp (RF) and −0.1 pp (LightGBM), and the worst gaps were −3.4 and −2.6 pp, against −15.8 and −16.9 pp with the absolute residual. Only 1 dataset per learner remained more than 2 pp short. Adding novelty-Mondrian calibration on top of the normalized score brought no further systematic improvement (one-sided Wilcoxon</w:t>
+      </w:r>
+      <w:r>
+        <w:t xml:space="preserve"> </w:t>
+      </w:r>
+      <m:oMath>
+        <m:r>
+          <m:t>p</m:t>
+        </m:r>
+      </m:oMath>
+      <w:r>
+        <w:t xml:space="preserve"> </w:t>
+      </w:r>
+      <w:r>
+        <w:t xml:space="preserve">= 0.545 and 0.551). Its worst values (−3.6 and −5.0 pp, both on solar_flare) again reflect the small novel calibration sets. In regression, a distance-adaptive score is therefore an effective heuristic mitigation. Unlike novelty-Mondrian calibration, however, it carries no group-conditional guarantee, and a residual shortfall of up to −3.4 pp remained. For classification, no comparably standard distance-normalized score exists; the six-bin distance-Mondrian variant (below) plays this role.</w:t>
+      </w:r>
+    </w:p>
+    <w:p>
+      <w:pPr>
+        <w:pStyle w:val="BodyText"/>
+      </w:pPr>
+      <w:r>
+        <w:rPr>
+          <w:bCs/>
+          <w:b/>
+        </w:rPr>
         <w:t xml:space="preserve">Computational cost.</w:t>
       </w:r>
       <w:r>
@@ -14689,7 +14878,7 @@
         </m:d>
       </m:oMath>
       <w:r>
-        <w:t xml:space="preserve">. The empirical results follow that mechanism. The shortfall grew with exposure in the benchmark data, it appeared as a dose–response when duplicates were injected into clean data, and it disappeared on datasets where duplicate groups carry conflicting labels, because there the model cannot over-cover its seen records. The role of model flexibility is supported only partly. In the injection experiment flexible ensembles were affected far more than regularized linear models, but varying regularization within a learner at the moderate exposures of the benchmark data produced no detectable change in the gap, although seen-record coverage fell as expected. Novelty-Mondrian calibration restored nominal coverage on novel records in every family, with set-size increases of a few percent, and it did nothing on duplicate-free data, as it should.</w:t>
+        <w:t xml:space="preserve">. The empirical results follow that mechanism. The shortfall grew with exposure in the benchmark data, it appeared as a dose–response when duplicates were injected into clean data, and it disappeared on datasets where duplicate groups carry conflicting labels, because there the model cannot over-cover its seen records. The role of model flexibility is supported only partly. In the injection experiment flexible ensembles were affected far more than regularized linear models, but varying regularization within a learner at the moderate exposures of the benchmark data produced no detectable change in the gap, although seen-record coverage fell as expected. Novelty-Mondrian calibration restored nominal coverage on novel records in every family, with set-size increases of a few percent, and it did nothing on duplicate-free data, as it should. A distance-normalized regression score also removed most of the shortfall, which shows that the problem is specific to scores that ignore how close a test record is to the training data.</w:t>
       </w:r>
     </w:p>
     <w:p>
@@ -14830,6 +15019,28 @@
           <w:bCs/>
           <w:b/>
         </w:rPr>
+        <w:t xml:space="preserve">Prefer distance-adaptive scores, and use novelty-Mondrian calibration when a guarantee is needed.</w:t>
+      </w:r>
+      <w:r>
+        <w:t xml:space="preserve"> </w:t>
+      </w:r>
+      <w:r>
+        <w:t xml:space="preserve">In our regression data, a nonconformity score normalized by nearest-neighbour distance removed most of the shortfall without any seen/novel split. It is a heuristic, though, and it left residual gaps of a few points. Novelty-Mondrian calibration is the option with a finite-sample guarantee.</w:t>
+      </w:r>
+    </w:p>
+    <w:p>
+      <w:pPr>
+        <w:numPr>
+          <w:ilvl w:val="0"/>
+          <w:numId w:val="1003"/>
+        </w:numPr>
+        <w:pStyle w:val="Compact"/>
+      </w:pPr>
+      <w:r>
+        <w:rPr>
+          <w:bCs/>
+          <w:b/>
+        </w:rPr>
         <w:t xml:space="preserve">Choose the estimand deliberately.</w:t>
       </w:r>
       <w:r>
@@ -15097,7 +15308,7 @@
         <w:pStyle w:val="FirstParagraph"/>
       </w:pPr>
       <w:r>
-        <w:t xml:space="preserve">Duplicate records do not invalidate the marginal guarantee of conformal prediction, but they can redistribute its errors onto new records. The size of that shift is given exactly by the exposure and the over-coverage of seen records. In standard tabular benchmarks the shift is negligible for most datasets but substantial for a predictable minority. A label-free audit identifies the minority, and novelty-Mondrian calibration repairs coverage on new records with a finite-sample guarantee at small cost. We recommend that conformal evaluations on tabular data report duplicate exposure and coverage on novel records alongside the usual marginal coverage.</w:t>
+        <w:t xml:space="preserve">Duplicate records do not invalidate the marginal guarantee of conformal prediction, but they can redistribute its errors onto new records. The size of that shift is given exactly by the exposure and the over-coverage of seen records. In standard tabular benchmarks the shift is negligible for most datasets but substantial for a predictable minority. A label-free audit identifies the minority. Distance-adaptive scores mitigate the problem, and novelty-Mondrian calibration repairs coverage on new records with a finite-sample guarantee at small cost. We recommend that conformal evaluations on tabular data report duplicate exposure and coverage on novel records alongside the usual marginal coverage.</w:t>
       </w:r>
     </w:p>
     <w:bookmarkEnd w:id="69"/>
@@ -15395,6 +15606,14 @@
         <w:pStyle w:val="BodyText"/>
       </w:pPr>
       <w:r>
+        <w:t xml:space="preserve">Hernandez-Hernandez S, Guo Q, Ballester PJ (2026) Conformal prediction of molecule-induced cancer cell growth inhibition challenged by strong distribution shifts. Pattern Recognit 172:112501. https://doi.org/10.1016/j.patcog.2025.112501</w:t>
+      </w:r>
+    </w:p>
+    <w:p>
+      <w:pPr>
+        <w:pStyle w:val="BodyText"/>
+      </w:pPr>
+      <w:r>
         <w:t xml:space="preserve">Holm S (1979) A simple sequentially rejective multiple test procedure. Scand J Stat 6(2):65–70</w:t>
       </w:r>
     </w:p>
@@ -15515,6 +15734,14 @@
         <w:pStyle w:val="BodyText"/>
       </w:pPr>
       <w:r>
+        <w:t xml:space="preserve">Romano Y, Barber RF, Sabatti C, Candès EJ (2020b) With malice toward none: assessing uncertainty via equalized coverage. Harv Data Sci Rev. https://doi.org/10.1162/99608f92.03f00592</w:t>
+      </w:r>
+    </w:p>
+    <w:p>
+      <w:pPr>
+        <w:pStyle w:val="BodyText"/>
+      </w:pPr>
+      <w:r>
         <w:t xml:space="preserve">Romano Y, Patterson E, Candès EJ (2019) Conformalized quantile regression. In: Advances in Neural Information Processing Systems 32. arXiv:1905.03222</w:t>
       </w:r>
     </w:p>
@@ -15531,7 +15758,7 @@
         <w:pStyle w:val="BodyText"/>
       </w:pPr>
       <w:r>
-        <w:t xml:space="preserve">Romano Y, Barber RF, Sabatti C, Candès EJ (2020b) With malice toward none: assessing uncertainty via equalized coverage. Harv Data Sci Rev. https://doi.org/10.1162/99608f92.03f00592</w:t>
+        <w:t xml:space="preserve">Roth S (2026) Which leakage types matter? A quantitative landscape across 2,047 benchmark datasets. arXiv:2604.04199 (preprint, not peer reviewed)</w:t>
       </w:r>
     </w:p>
     <w:p>
@@ -15539,7 +15766,7 @@
         <w:pStyle w:val="BodyText"/>
       </w:pPr>
       <w:r>
-        <w:t xml:space="preserve">Roth S (2026) Which leakage types matter? A quantitative landscape across 2,047 benchmark datasets. arXiv:2604.04199 (preprint, not peer reviewed)</w:t>
+        <w:t xml:space="preserve">Sadinle M, Lei J, Wasserman L (2019) Least ambiguous set-valued classifiers with bounded error levels. J Am Stat Assoc 114(525):223–234. https://doi.org/10.1080/01621459.2017.1395341</w:t>
       </w:r>
     </w:p>
     <w:p>
@@ -15547,7 +15774,7 @@
         <w:pStyle w:val="BodyText"/>
       </w:pPr>
       <w:r>
-        <w:t xml:space="preserve">Sadinle M, Lei J, Wasserman L (2019) Least ambiguous set-valued classifiers with bounded error levels. J Am Stat Assoc 114(525):223–234. https://doi.org/10.1080/01621459.2017.1395341</w:t>
+        <w:t xml:space="preserve">Seo J-I, Jeon YE, Kim Y (2026) Calibrated Mondrian conformal prediction for uncertainty quantification in spatial modeling. Pattern Recognit 180:114113. https://doi.org/10.1016/j.patcog.2026.114113</w:t>
       </w:r>
     </w:p>
     <w:p>
@@ -15612,6 +15839,14 @@
       </w:pPr>
       <w:r>
         <w:t xml:space="preserve">Wilcoxon F (1945) Individual comparisons by ranking methods. Biometrics Bull 1(6):80–83. https://doi.org/10.2307/3001968</w:t>
+      </w:r>
+    </w:p>
+    <w:p>
+      <w:pPr>
+        <w:pStyle w:val="BodyText"/>
+      </w:pPr>
+      <w:r>
+        <w:t xml:space="preserve">Zhang R, Zhou P (2026) A Mondrian conformal predictive system with improved decision trees for uncertainty quantification under heteroscedasticity. Pattern Recognit 172:112338. https://doi.org/10.1016/j.patcog.2025.112338</w:t>
       </w:r>
     </w:p>
     <w:bookmarkEnd w:id="71"/>

</xml_diff>